<commit_message>
docs: update lab 1 report
</commit_message>
<xml_diff>
--- a/report/Отчет_ЛР1.docx
+++ b/report/Отчет_ЛР1.docx
@@ -297,7 +297,7 @@
       <w:r>
         <w:fldChar w:fldCharType="separate"/>
       </w:r>
-      <w:hyperlink w:anchor="_Toc242378537" w:history="1">
+      <w:hyperlink w:anchor="_Toc242385932" w:history="1">
         <w:r>
           <w:rPr>
             <w:rStyle w:val="aff8"/>
@@ -324,7 +324,7 @@
             <w:noProof/>
             <w:webHidden/>
           </w:rPr>
-          <w:instrText xml:space="preserve"> PAGEREF _Toc242378537 \h </w:instrText>
+          <w:instrText xml:space="preserve"> PAGEREF _Toc242385932 \h </w:instrText>
         </w:r>
         <w:r>
           <w:rPr>
@@ -370,7 +370,7 @@
           <w14:ligatures w14:val="standardContextual"/>
         </w:rPr>
       </w:pPr>
-      <w:hyperlink w:anchor="_Toc242378538" w:history="1">
+      <w:hyperlink w:anchor="_Toc242385933" w:history="1">
         <w:r>
           <w:rPr>
             <w:rStyle w:val="aff8"/>
@@ -397,7 +397,7 @@
             <w:noProof/>
             <w:webHidden/>
           </w:rPr>
-          <w:instrText xml:space="preserve"> PAGEREF _Toc242378538 \h </w:instrText>
+          <w:instrText xml:space="preserve"> PAGEREF _Toc242385933 \h </w:instrText>
         </w:r>
         <w:r>
           <w:rPr>
@@ -443,7 +443,7 @@
           <w14:ligatures w14:val="standardContextual"/>
         </w:rPr>
       </w:pPr>
-      <w:hyperlink w:anchor="_Toc242378539" w:history="1">
+      <w:hyperlink w:anchor="_Toc242385934" w:history="1">
         <w:r>
           <w:rPr>
             <w:rStyle w:val="aff8"/>
@@ -470,7 +470,7 @@
             <w:noProof/>
             <w:webHidden/>
           </w:rPr>
-          <w:instrText xml:space="preserve"> PAGEREF _Toc242378539 \h </w:instrText>
+          <w:instrText xml:space="preserve"> PAGEREF _Toc242385934 \h </w:instrText>
         </w:r>
         <w:r>
           <w:rPr>
@@ -516,7 +516,7 @@
           <w14:ligatures w14:val="standardContextual"/>
         </w:rPr>
       </w:pPr>
-      <w:hyperlink w:anchor="_Toc242378540" w:history="1">
+      <w:hyperlink w:anchor="_Toc242385935" w:history="1">
         <w:r>
           <w:rPr>
             <w:rStyle w:val="aff8"/>
@@ -543,7 +543,7 @@
             <w:noProof/>
             <w:webHidden/>
           </w:rPr>
-          <w:instrText xml:space="preserve"> PAGEREF _Toc242378540 \h </w:instrText>
+          <w:instrText xml:space="preserve"> PAGEREF _Toc242385935 \h </w:instrText>
         </w:r>
         <w:r>
           <w:rPr>
@@ -589,7 +589,7 @@
           <w14:ligatures w14:val="standardContextual"/>
         </w:rPr>
       </w:pPr>
-      <w:hyperlink w:anchor="_Toc242378541" w:history="1">
+      <w:hyperlink w:anchor="_Toc242385936" w:history="1">
         <w:r>
           <w:rPr>
             <w:rStyle w:val="aff8"/>
@@ -631,7 +631,7 @@
             <w:noProof/>
             <w:webHidden/>
           </w:rPr>
-          <w:instrText xml:space="preserve"> PAGEREF _Toc242378541 \h </w:instrText>
+          <w:instrText xml:space="preserve"> PAGEREF _Toc242385936 \h </w:instrText>
         </w:r>
         <w:r>
           <w:rPr>
@@ -677,7 +677,7 @@
           <w14:ligatures w14:val="standardContextual"/>
         </w:rPr>
       </w:pPr>
-      <w:hyperlink w:anchor="_Toc242378542" w:history="1">
+      <w:hyperlink w:anchor="_Toc242385937" w:history="1">
         <w:r>
           <w:rPr>
             <w:rStyle w:val="aff8"/>
@@ -719,7 +719,7 @@
             <w:noProof/>
             <w:webHidden/>
           </w:rPr>
-          <w:instrText xml:space="preserve"> PAGEREF _Toc242378542 \h </w:instrText>
+          <w:instrText xml:space="preserve"> PAGEREF _Toc242385937 \h </w:instrText>
         </w:r>
         <w:r>
           <w:rPr>
@@ -765,7 +765,7 @@
           <w14:ligatures w14:val="standardContextual"/>
         </w:rPr>
       </w:pPr>
-      <w:hyperlink w:anchor="_Toc242378543" w:history="1">
+      <w:hyperlink w:anchor="_Toc242385938" w:history="1">
         <w:r>
           <w:rPr>
             <w:rStyle w:val="aff8"/>
@@ -807,7 +807,7 @@
             <w:noProof/>
             <w:webHidden/>
           </w:rPr>
-          <w:instrText xml:space="preserve"> PAGEREF _Toc242378543 \h </w:instrText>
+          <w:instrText xml:space="preserve"> PAGEREF _Toc242385938 \h </w:instrText>
         </w:r>
         <w:r>
           <w:rPr>
@@ -853,7 +853,7 @@
           <w14:ligatures w14:val="standardContextual"/>
         </w:rPr>
       </w:pPr>
-      <w:hyperlink w:anchor="_Toc242378544" w:history="1">
+      <w:hyperlink w:anchor="_Toc242385939" w:history="1">
         <w:r>
           <w:rPr>
             <w:rStyle w:val="aff8"/>
@@ -895,7 +895,7 @@
             <w:noProof/>
             <w:webHidden/>
           </w:rPr>
-          <w:instrText xml:space="preserve"> PAGEREF _Toc242378544 \h </w:instrText>
+          <w:instrText xml:space="preserve"> PAGEREF _Toc242385939 \h </w:instrText>
         </w:r>
         <w:r>
           <w:rPr>
@@ -941,7 +941,7 @@
           <w14:ligatures w14:val="standardContextual"/>
         </w:rPr>
       </w:pPr>
-      <w:hyperlink w:anchor="_Toc242378545" w:history="1">
+      <w:hyperlink w:anchor="_Toc242385940" w:history="1">
         <w:r>
           <w:rPr>
             <w:rStyle w:val="aff8"/>
@@ -968,7 +968,7 @@
             <w:noProof/>
             <w:webHidden/>
           </w:rPr>
-          <w:instrText xml:space="preserve"> PAGEREF _Toc242378545 \h </w:instrText>
+          <w:instrText xml:space="preserve"> PAGEREF _Toc242385940 \h </w:instrText>
         </w:r>
         <w:r>
           <w:rPr>
@@ -1014,7 +1014,7 @@
           <w14:ligatures w14:val="standardContextual"/>
         </w:rPr>
       </w:pPr>
-      <w:hyperlink w:anchor="_Toc242378546" w:history="1">
+      <w:hyperlink w:anchor="_Toc242385941" w:history="1">
         <w:r>
           <w:rPr>
             <w:rStyle w:val="aff8"/>
@@ -1056,7 +1056,7 @@
             <w:noProof/>
             <w:webHidden/>
           </w:rPr>
-          <w:instrText xml:space="preserve"> PAGEREF _Toc242378546 \h </w:instrText>
+          <w:instrText xml:space="preserve"> PAGEREF _Toc242385941 \h </w:instrText>
         </w:r>
         <w:r>
           <w:rPr>
@@ -1102,7 +1102,7 @@
           <w14:ligatures w14:val="standardContextual"/>
         </w:rPr>
       </w:pPr>
-      <w:hyperlink w:anchor="_Toc242378547" w:history="1">
+      <w:hyperlink w:anchor="_Toc242385942" w:history="1">
         <w:r>
           <w:rPr>
             <w:rStyle w:val="aff8"/>
@@ -1144,7 +1144,7 @@
             <w:noProof/>
             <w:webHidden/>
           </w:rPr>
-          <w:instrText xml:space="preserve"> PAGEREF _Toc242378547 \h </w:instrText>
+          <w:instrText xml:space="preserve"> PAGEREF _Toc242385942 \h </w:instrText>
         </w:r>
         <w:r>
           <w:rPr>
@@ -1190,7 +1190,7 @@
           <w14:ligatures w14:val="standardContextual"/>
         </w:rPr>
       </w:pPr>
-      <w:hyperlink w:anchor="_Toc242378548" w:history="1">
+      <w:hyperlink w:anchor="_Toc242385943" w:history="1">
         <w:r>
           <w:rPr>
             <w:rStyle w:val="aff8"/>
@@ -1217,7 +1217,7 @@
             <w:noProof/>
             <w:webHidden/>
           </w:rPr>
-          <w:instrText xml:space="preserve"> PAGEREF _Toc242378548 \h </w:instrText>
+          <w:instrText xml:space="preserve"> PAGEREF _Toc242385943 \h </w:instrText>
         </w:r>
         <w:r>
           <w:rPr>
@@ -1263,7 +1263,7 @@
           <w14:ligatures w14:val="standardContextual"/>
         </w:rPr>
       </w:pPr>
-      <w:hyperlink w:anchor="_Toc242378549" w:history="1">
+      <w:hyperlink w:anchor="_Toc242385944" w:history="1">
         <w:r>
           <w:rPr>
             <w:rStyle w:val="aff8"/>
@@ -1305,7 +1305,7 @@
             <w:noProof/>
             <w:webHidden/>
           </w:rPr>
-          <w:instrText xml:space="preserve"> PAGEREF _Toc242378549 \h </w:instrText>
+          <w:instrText xml:space="preserve"> PAGEREF _Toc242385944 \h </w:instrText>
         </w:r>
         <w:r>
           <w:rPr>
@@ -1351,7 +1351,7 @@
           <w14:ligatures w14:val="standardContextual"/>
         </w:rPr>
       </w:pPr>
-      <w:hyperlink w:anchor="_Toc242378550" w:history="1">
+      <w:hyperlink w:anchor="_Toc242385945" w:history="1">
         <w:r>
           <w:rPr>
             <w:rStyle w:val="aff8"/>
@@ -1401,7 +1401,7 @@
             <w:noProof/>
             <w:webHidden/>
           </w:rPr>
-          <w:instrText xml:space="preserve"> PAGEREF _Toc242378550 \h </w:instrText>
+          <w:instrText xml:space="preserve"> PAGEREF _Toc242385945 \h </w:instrText>
         </w:r>
         <w:r>
           <w:rPr>
@@ -1447,7 +1447,7 @@
           <w14:ligatures w14:val="standardContextual"/>
         </w:rPr>
       </w:pPr>
-      <w:hyperlink w:anchor="_Toc242378551" w:history="1">
+      <w:hyperlink w:anchor="_Toc242385946" w:history="1">
         <w:r>
           <w:rPr>
             <w:rStyle w:val="aff8"/>
@@ -1474,7 +1474,7 @@
             <w:noProof/>
             <w:webHidden/>
           </w:rPr>
-          <w:instrText xml:space="preserve"> PAGEREF _Toc242378551 \h </w:instrText>
+          <w:instrText xml:space="preserve"> PAGEREF _Toc242385946 \h </w:instrText>
         </w:r>
         <w:r>
           <w:rPr>
@@ -1520,7 +1520,7 @@
           <w14:ligatures w14:val="standardContextual"/>
         </w:rPr>
       </w:pPr>
-      <w:hyperlink w:anchor="_Toc242378552" w:history="1">
+      <w:hyperlink w:anchor="_Toc242385947" w:history="1">
         <w:r>
           <w:rPr>
             <w:rStyle w:val="aff8"/>
@@ -1547,7 +1547,7 @@
             <w:noProof/>
             <w:webHidden/>
           </w:rPr>
-          <w:instrText xml:space="preserve"> PAGEREF _Toc242378552 \h </w:instrText>
+          <w:instrText xml:space="preserve"> PAGEREF _Toc242385947 \h </w:instrText>
         </w:r>
         <w:r>
           <w:rPr>
@@ -1593,7 +1593,7 @@
           <w14:ligatures w14:val="standardContextual"/>
         </w:rPr>
       </w:pPr>
-      <w:hyperlink w:anchor="_Toc242378553" w:history="1">
+      <w:hyperlink w:anchor="_Toc242385948" w:history="1">
         <w:r>
           <w:rPr>
             <w:rStyle w:val="aff8"/>
@@ -1628,7 +1628,7 @@
             <w:noProof/>
             <w:webHidden/>
           </w:rPr>
-          <w:instrText xml:space="preserve"> PAGEREF _Toc242378553 \h </w:instrText>
+          <w:instrText xml:space="preserve"> PAGEREF _Toc242385948 \h </w:instrText>
         </w:r>
         <w:r>
           <w:rPr>
@@ -1674,7 +1674,7 @@
           <w14:ligatures w14:val="standardContextual"/>
         </w:rPr>
       </w:pPr>
-      <w:hyperlink w:anchor="_Toc242378554" w:history="1">
+      <w:hyperlink w:anchor="_Toc242385949" w:history="1">
         <w:r>
           <w:rPr>
             <w:rStyle w:val="aff8"/>
@@ -1701,7 +1701,7 @@
             <w:noProof/>
             <w:webHidden/>
           </w:rPr>
-          <w:instrText xml:space="preserve"> PAGEREF _Toc242378554 \h </w:instrText>
+          <w:instrText xml:space="preserve"> PAGEREF _Toc242385949 \h </w:instrText>
         </w:r>
         <w:r>
           <w:rPr>
@@ -1747,7 +1747,7 @@
         <w:pStyle w:val="1"/>
         <w:ind w:firstLine="709"/>
       </w:pPr>
-      <w:bookmarkStart w:id="0" w:name="_Toc242378537"/>
+      <w:bookmarkStart w:id="0" w:name="_Toc242385932"/>
       <w:r>
         <w:rPr>
           <w:rFonts w:ascii="Times New Roman" w:hAnsi="Times New Roman"/>
@@ -1803,7 +1803,7 @@
         <w:pStyle w:val="1"/>
         <w:ind w:firstLine="709"/>
       </w:pPr>
-      <w:bookmarkStart w:id="1" w:name="_Toc242378538"/>
+      <w:bookmarkStart w:id="1" w:name="_Toc242385933"/>
       <w:r>
         <w:rPr>
           <w:rFonts w:ascii="Times New Roman" w:hAnsi="Times New Roman"/>
@@ -1979,7 +1979,7 @@
         <w:pStyle w:val="1"/>
         <w:ind w:firstLine="709"/>
       </w:pPr>
-      <w:bookmarkStart w:id="2" w:name="_Toc242378539"/>
+      <w:bookmarkStart w:id="2" w:name="_Toc242385934"/>
       <w:r>
         <w:rPr>
           <w:rFonts w:ascii="Times New Roman" w:hAnsi="Times New Roman"/>
@@ -1995,7 +1995,7 @@
         <w:spacing w:before="360"/>
         <w:ind w:firstLine="709"/>
       </w:pPr>
-      <w:bookmarkStart w:id="3" w:name="_Toc242378540"/>
+      <w:bookmarkStart w:id="3" w:name="_Toc242385935"/>
       <w:r>
         <w:rPr>
           <w:rFonts w:ascii="Times New Roman" w:hAnsi="Times New Roman"/>
@@ -2055,16 +2055,16 @@
         <w:t>SDK</w:t>
       </w:r>
       <w:r>
-        <w:t xml:space="preserve"> 9.0.318) с целевой платформой </w:t>
+        <w:t xml:space="preserve"> 10.0.401) с целевой платформой </w:t>
       </w:r>
       <w:r>
         <w:rPr>
           <w:i/>
         </w:rPr>
-        <w:t>net8.0</w:t>
-      </w:r>
-      <w:r>
-        <w:t xml:space="preserve">, как допускает методика. Библиотека </w:t>
+        <w:t>net10.0</w:t>
+      </w:r>
+      <w:r>
+        <w:t xml:space="preserve">, как указано в методических указаниях. Библиотека </w:t>
       </w:r>
       <w:r>
         <w:rPr>
@@ -2103,160 +2103,112 @@
     </w:p>
     <w:p>
       <w:pPr>
-        <w:spacing w:line="240" w:lineRule="auto"/>
-      </w:pPr>
-      <w:r>
-        <w:rPr>
-          <w:i/>
-          <w:sz w:val="24"/>
-        </w:rPr>
+        <w:pStyle w:val="Listing"/>
+      </w:pPr>
+      <w:r>
         <w:t>&lt;Project Sdk="Microsoft.NET.Sdk"&gt;</w:t>
       </w:r>
     </w:p>
     <w:p>
       <w:pPr>
-        <w:spacing w:line="240" w:lineRule="auto"/>
-      </w:pPr>
-    </w:p>
-    <w:p>
-      <w:pPr>
-        <w:spacing w:line="240" w:lineRule="auto"/>
-      </w:pPr>
-      <w:r>
-        <w:rPr>
-          <w:i/>
-          <w:sz w:val="24"/>
-        </w:rPr>
+        <w:pStyle w:val="Listing"/>
+      </w:pPr>
+    </w:p>
+    <w:p>
+      <w:pPr>
+        <w:pStyle w:val="Listing"/>
+      </w:pPr>
+      <w:r>
         <w:t xml:space="preserve">  &lt;PropertyGroup&gt;</w:t>
       </w:r>
     </w:p>
     <w:p>
       <w:pPr>
-        <w:spacing w:line="240" w:lineRule="auto"/>
-      </w:pPr>
-      <w:r>
-        <w:rPr>
-          <w:i/>
-          <w:sz w:val="24"/>
-        </w:rPr>
+        <w:pStyle w:val="Listing"/>
+      </w:pPr>
+      <w:r>
         <w:t xml:space="preserve">    &lt;OutputType&gt;Exe&lt;/OutputType&gt;</w:t>
       </w:r>
     </w:p>
     <w:p>
       <w:pPr>
-        <w:spacing w:line="240" w:lineRule="auto"/>
-      </w:pPr>
-      <w:r>
-        <w:rPr>
-          <w:i/>
-          <w:sz w:val="24"/>
-        </w:rPr>
-        <w:t xml:space="preserve">    &lt;TargetFramework&gt;net8.0&lt;/TargetFramework&gt;</w:t>
-      </w:r>
-    </w:p>
-    <w:p>
-      <w:pPr>
-        <w:spacing w:line="240" w:lineRule="auto"/>
-      </w:pPr>
-      <w:r>
-        <w:rPr>
-          <w:i/>
-          <w:sz w:val="24"/>
-        </w:rPr>
+        <w:pStyle w:val="Listing"/>
+      </w:pPr>
+      <w:r>
+        <w:t xml:space="preserve">    &lt;TargetFramework&gt;net10.0&lt;/TargetFramework&gt;</w:t>
+      </w:r>
+    </w:p>
+    <w:p>
+      <w:pPr>
+        <w:pStyle w:val="Listing"/>
+      </w:pPr>
+      <w:r>
         <w:t xml:space="preserve">    &lt;ImplicitUsings&gt;enable&lt;/ImplicitUsings&gt;</w:t>
       </w:r>
     </w:p>
     <w:p>
       <w:pPr>
-        <w:spacing w:line="240" w:lineRule="auto"/>
-      </w:pPr>
-      <w:r>
-        <w:rPr>
-          <w:i/>
-          <w:sz w:val="24"/>
-        </w:rPr>
+        <w:pStyle w:val="Listing"/>
+      </w:pPr>
+      <w:r>
         <w:t xml:space="preserve">    &lt;Nullable&gt;enable&lt;/Nullable&gt;</w:t>
       </w:r>
     </w:p>
     <w:p>
       <w:pPr>
-        <w:spacing w:line="240" w:lineRule="auto"/>
-      </w:pPr>
-      <w:r>
-        <w:rPr>
-          <w:i/>
-          <w:sz w:val="24"/>
-        </w:rPr>
+        <w:pStyle w:val="Listing"/>
+      </w:pPr>
+      <w:r>
         <w:t xml:space="preserve">    &lt;AllowUnsafeBlocks&gt;true&lt;/AllowUnsafeBlocks&gt;</w:t>
       </w:r>
     </w:p>
     <w:p>
       <w:pPr>
-        <w:spacing w:line="240" w:lineRule="auto"/>
-      </w:pPr>
-      <w:r>
-        <w:rPr>
-          <w:i/>
-          <w:sz w:val="24"/>
-        </w:rPr>
+        <w:pStyle w:val="Listing"/>
+      </w:pPr>
+      <w:r>
         <w:t xml:space="preserve">  &lt;/PropertyGroup&gt;</w:t>
       </w:r>
     </w:p>
     <w:p>
       <w:pPr>
-        <w:spacing w:line="240" w:lineRule="auto"/>
-      </w:pPr>
-    </w:p>
-    <w:p>
-      <w:pPr>
-        <w:spacing w:line="240" w:lineRule="auto"/>
-      </w:pPr>
-      <w:r>
-        <w:rPr>
-          <w:i/>
-          <w:sz w:val="24"/>
-        </w:rPr>
+        <w:pStyle w:val="Listing"/>
+      </w:pPr>
+    </w:p>
+    <w:p>
+      <w:pPr>
+        <w:pStyle w:val="Listing"/>
+      </w:pPr>
+      <w:r>
         <w:t xml:space="preserve">  &lt;ItemGroup&gt;</w:t>
       </w:r>
     </w:p>
     <w:p>
       <w:pPr>
-        <w:spacing w:line="240" w:lineRule="auto"/>
-      </w:pPr>
-      <w:r>
-        <w:rPr>
-          <w:i/>
-          <w:sz w:val="24"/>
-        </w:rPr>
+        <w:pStyle w:val="Listing"/>
+      </w:pPr>
+      <w:r>
         <w:t xml:space="preserve">    &lt;PackageReference Include="BenchmarkDotNet" Version="0.14.0" /&gt;</w:t>
       </w:r>
     </w:p>
     <w:p>
       <w:pPr>
-        <w:spacing w:line="240" w:lineRule="auto"/>
-      </w:pPr>
-      <w:r>
-        <w:rPr>
-          <w:i/>
-          <w:sz w:val="24"/>
-        </w:rPr>
+        <w:pStyle w:val="Listing"/>
+      </w:pPr>
+      <w:r>
         <w:t xml:space="preserve">  &lt;/ItemGroup&gt;</w:t>
       </w:r>
     </w:p>
     <w:p>
       <w:pPr>
-        <w:spacing w:line="240" w:lineRule="auto"/>
-      </w:pPr>
-    </w:p>
-    <w:p>
-      <w:pPr>
-        <w:spacing w:line="240" w:lineRule="auto"/>
-      </w:pPr>
-      <w:r>
-        <w:rPr>
-          <w:i/>
-          <w:sz w:val="24"/>
-        </w:rPr>
+        <w:pStyle w:val="Listing"/>
+      </w:pPr>
+    </w:p>
+    <w:p>
+      <w:pPr>
+        <w:pStyle w:val="Listing"/>
+      </w:pPr>
+      <w:r>
         <w:t>&lt;/Project&gt;</w:t>
       </w:r>
     </w:p>
@@ -2312,7 +2264,7 @@
         <w:spacing w:before="360"/>
         <w:ind w:firstLine="709"/>
       </w:pPr>
-      <w:bookmarkStart w:id="4" w:name="_Toc242378541"/>
+      <w:bookmarkStart w:id="4" w:name="_Toc242385936"/>
       <w:r>
         <w:rPr>
           <w:rFonts w:ascii="Times New Roman" w:hAnsi="Times New Roman"/>
@@ -2409,7 +2361,7 @@
         </w:rPr>
         <w:lastRenderedPageBreak/>
         <w:drawing>
-          <wp:inline distT="0" distB="0" distL="0" distR="0" wp14:anchorId="0EC19364" wp14:editId="33401B13">
+          <wp:inline distT="0" distB="0" distL="0" distR="0" wp14:anchorId="067114DA" wp14:editId="3B39A272">
             <wp:extent cx="5580000" cy="4507340"/>
             <wp:effectExtent l="0" t="0" r="0" b="0"/>
             <wp:docPr id="1" name="Picture 1"/>
@@ -2536,7 +2488,7 @@
         <w:spacing w:before="360"/>
         <w:ind w:firstLine="709"/>
       </w:pPr>
-      <w:bookmarkStart w:id="5" w:name="_Toc242378542"/>
+      <w:bookmarkStart w:id="5" w:name="_Toc242385937"/>
       <w:r>
         <w:rPr>
           <w:rFonts w:ascii="Times New Roman" w:hAnsi="Times New Roman"/>
@@ -2603,25 +2555,17 @@
     </w:p>
     <w:p>
       <w:pPr>
-        <w:spacing w:line="240" w:lineRule="auto"/>
-      </w:pPr>
-      <w:r>
-        <w:rPr>
-          <w:i/>
-          <w:sz w:val="24"/>
-        </w:rPr>
+        <w:pStyle w:val="Listing"/>
+      </w:pPr>
+      <w:r>
         <w:t>// Задание 1: произведение двух целых чисел</w:t>
       </w:r>
     </w:p>
     <w:p>
       <w:pPr>
-        <w:spacing w:line="240" w:lineRule="auto"/>
-      </w:pPr>
-      <w:r>
-        <w:rPr>
-          <w:i/>
-          <w:sz w:val="24"/>
-        </w:rPr>
+        <w:pStyle w:val="Listing"/>
+      </w:pPr>
+      <w:r>
         <w:t>static int Multiply(int a, int b) =&gt; a * b;</w:t>
       </w:r>
     </w:p>
@@ -2656,7 +2600,7 @@
         </w:rPr>
         <w:lastRenderedPageBreak/>
         <w:drawing>
-          <wp:inline distT="0" distB="0" distL="0" distR="0" wp14:anchorId="3D5B8723" wp14:editId="7B5C1E61">
+          <wp:inline distT="0" distB="0" distL="0" distR="0" wp14:anchorId="2D19D28C" wp14:editId="52AF043F">
             <wp:extent cx="5580000" cy="1646913"/>
             <wp:effectExtent l="0" t="0" r="0" b="0"/>
             <wp:docPr id="2" name="Picture 2"/>
@@ -2813,7 +2757,7 @@
         <w:spacing w:before="360"/>
         <w:ind w:firstLine="709"/>
       </w:pPr>
-      <w:bookmarkStart w:id="6" w:name="_Toc242378543"/>
+      <w:bookmarkStart w:id="6" w:name="_Toc242385938"/>
       <w:r>
         <w:rPr>
           <w:rFonts w:ascii="Times New Roman" w:hAnsi="Times New Roman"/>
@@ -2882,7 +2826,7 @@
           <w:noProof/>
         </w:rPr>
         <w:drawing>
-          <wp:inline distT="0" distB="0" distL="0" distR="0" wp14:anchorId="1806792F" wp14:editId="4B63C2FC">
+          <wp:inline distT="0" distB="0" distL="0" distR="0" wp14:anchorId="1F42D85B" wp14:editId="6272CB03">
             <wp:extent cx="5580000" cy="1386874"/>
             <wp:effectExtent l="0" t="0" r="0" b="0"/>
             <wp:docPr id="3" name="Picture 3"/>
@@ -2970,7 +2914,7 @@
         <w:spacing w:before="360"/>
         <w:ind w:firstLine="709"/>
       </w:pPr>
-      <w:bookmarkStart w:id="7" w:name="_Toc242378544"/>
+      <w:bookmarkStart w:id="7" w:name="_Toc242385939"/>
       <w:r>
         <w:rPr>
           <w:rFonts w:ascii="Times New Roman" w:hAnsi="Times New Roman"/>
@@ -3059,398 +3003,271 @@
     </w:p>
     <w:p>
       <w:pPr>
-        <w:spacing w:line="240" w:lineRule="auto"/>
-      </w:pPr>
-      <w:r>
-        <w:rPr>
-          <w:i/>
-          <w:sz w:val="24"/>
-        </w:rPr>
+        <w:pStyle w:val="Listing"/>
+      </w:pPr>
+      <w:r>
         <w:t>// Задание 2.1: n! рекурсивно</w:t>
       </w:r>
     </w:p>
     <w:p>
       <w:pPr>
-        <w:spacing w:line="240" w:lineRule="auto"/>
-      </w:pPr>
-      <w:r>
-        <w:rPr>
-          <w:i/>
-          <w:sz w:val="24"/>
-        </w:rPr>
+        <w:pStyle w:val="Listing"/>
+      </w:pPr>
+      <w:r>
         <w:t>// int Factorial(int n) { if (n &lt;= 1) return 1; return n * Factorial(n - 1); }</w:t>
       </w:r>
     </w:p>
     <w:p>
       <w:pPr>
-        <w:spacing w:line="240" w:lineRule="auto"/>
-      </w:pPr>
-      <w:r>
-        <w:rPr>
-          <w:i/>
-          <w:sz w:val="24"/>
-        </w:rPr>
+        <w:pStyle w:val="Listing"/>
+      </w:pPr>
+      <w:r>
         <w:t>public static Func&lt;int, int&gt; CreateRecursiveFactorialMethod()</w:t>
       </w:r>
     </w:p>
     <w:p>
       <w:pPr>
-        <w:spacing w:line="240" w:lineRule="auto"/>
-      </w:pPr>
-      <w:r>
-        <w:rPr>
-          <w:i/>
-          <w:sz w:val="24"/>
-        </w:rPr>
+        <w:pStyle w:val="Listing"/>
+      </w:pPr>
+      <w:r>
         <w:t>{</w:t>
       </w:r>
     </w:p>
     <w:p>
       <w:pPr>
-        <w:spacing w:line="240" w:lineRule="auto"/>
-      </w:pPr>
-      <w:r>
-        <w:rPr>
-          <w:i/>
-          <w:sz w:val="24"/>
-        </w:rPr>
+        <w:pStyle w:val="Listing"/>
+      </w:pPr>
+      <w:r>
         <w:t xml:space="preserve">    DynamicMethod dynamicMethod = new DynamicMethod(</w:t>
       </w:r>
     </w:p>
     <w:p>
       <w:pPr>
-        <w:spacing w:line="240" w:lineRule="auto"/>
-      </w:pPr>
-      <w:r>
-        <w:rPr>
-          <w:i/>
-          <w:sz w:val="24"/>
-        </w:rPr>
+        <w:pStyle w:val="Listing"/>
+      </w:pPr>
+      <w:r>
         <w:t xml:space="preserve">        "RecursiveFactorial",</w:t>
       </w:r>
     </w:p>
     <w:p>
       <w:pPr>
-        <w:spacing w:line="240" w:lineRule="auto"/>
-      </w:pPr>
-      <w:r>
-        <w:rPr>
-          <w:i/>
-          <w:sz w:val="24"/>
-        </w:rPr>
+        <w:pStyle w:val="Listing"/>
+      </w:pPr>
+      <w:r>
         <w:t xml:space="preserve">        typeof(int),</w:t>
       </w:r>
     </w:p>
     <w:p>
       <w:pPr>
-        <w:spacing w:line="240" w:lineRule="auto"/>
-      </w:pPr>
-      <w:r>
-        <w:rPr>
-          <w:i/>
-          <w:sz w:val="24"/>
-        </w:rPr>
+        <w:pStyle w:val="Listing"/>
+      </w:pPr>
+      <w:r>
         <w:t xml:space="preserve">        new[] { typeof(int) },</w:t>
       </w:r>
     </w:p>
     <w:p>
       <w:pPr>
-        <w:spacing w:line="240" w:lineRule="auto"/>
-      </w:pPr>
-      <w:r>
-        <w:rPr>
-          <w:i/>
-          <w:sz w:val="24"/>
-        </w:rPr>
+        <w:pStyle w:val="Listing"/>
+      </w:pPr>
+      <w:r>
         <w:t xml:space="preserve">        typeof(ILGeneratorDemo).Module</w:t>
       </w:r>
     </w:p>
     <w:p>
       <w:pPr>
-        <w:spacing w:line="240" w:lineRule="auto"/>
-      </w:pPr>
-      <w:r>
-        <w:rPr>
-          <w:i/>
-          <w:sz w:val="24"/>
-        </w:rPr>
+        <w:pStyle w:val="Listing"/>
+      </w:pPr>
+      <w:r>
         <w:t xml:space="preserve">    );</w:t>
       </w:r>
     </w:p>
     <w:p>
       <w:pPr>
-        <w:spacing w:line="240" w:lineRule="auto"/>
-      </w:pPr>
-    </w:p>
-    <w:p>
-      <w:pPr>
-        <w:spacing w:line="240" w:lineRule="auto"/>
-      </w:pPr>
-      <w:r>
-        <w:rPr>
-          <w:i/>
-          <w:sz w:val="24"/>
-        </w:rPr>
+        <w:pStyle w:val="Listing"/>
+      </w:pPr>
+    </w:p>
+    <w:p>
+      <w:pPr>
+        <w:pStyle w:val="Listing"/>
+      </w:pPr>
+      <w:r>
         <w:t xml:space="preserve">    ILGenerator il = dynamicMethod.GetILGenerator();</w:t>
       </w:r>
     </w:p>
     <w:p>
       <w:pPr>
-        <w:spacing w:line="240" w:lineRule="auto"/>
-      </w:pPr>
-    </w:p>
-    <w:p>
-      <w:pPr>
-        <w:spacing w:line="240" w:lineRule="auto"/>
-      </w:pPr>
-      <w:r>
-        <w:rPr>
-          <w:i/>
-          <w:sz w:val="24"/>
-        </w:rPr>
+        <w:pStyle w:val="Listing"/>
+      </w:pPr>
+    </w:p>
+    <w:p>
+      <w:pPr>
+        <w:pStyle w:val="Listing"/>
+      </w:pPr>
+      <w:r>
         <w:t xml:space="preserve">    Label recurse = il.DefineLabel();</w:t>
       </w:r>
     </w:p>
     <w:p>
       <w:pPr>
-        <w:spacing w:line="240" w:lineRule="auto"/>
-      </w:pPr>
-    </w:p>
-    <w:p>
-      <w:pPr>
-        <w:spacing w:line="240" w:lineRule="auto"/>
-      </w:pPr>
-      <w:r>
-        <w:rPr>
-          <w:i/>
-          <w:sz w:val="24"/>
-        </w:rPr>
+        <w:pStyle w:val="Listing"/>
+      </w:pPr>
+    </w:p>
+    <w:p>
+      <w:pPr>
+        <w:pStyle w:val="Listing"/>
+      </w:pPr>
+      <w:r>
         <w:t xml:space="preserve">    // if (n &gt; 1) goto recurse;</w:t>
       </w:r>
     </w:p>
     <w:p>
       <w:pPr>
-        <w:spacing w:line="240" w:lineRule="auto"/>
-      </w:pPr>
-      <w:r>
-        <w:rPr>
-          <w:i/>
-          <w:sz w:val="24"/>
-        </w:rPr>
+        <w:pStyle w:val="Listing"/>
+      </w:pPr>
+      <w:r>
         <w:t xml:space="preserve">    il.Emit(OpCodes.Ldarg_0);</w:t>
       </w:r>
     </w:p>
     <w:p>
       <w:pPr>
-        <w:spacing w:line="240" w:lineRule="auto"/>
-      </w:pPr>
-      <w:r>
-        <w:rPr>
-          <w:i/>
-          <w:sz w:val="24"/>
-        </w:rPr>
+        <w:pStyle w:val="Listing"/>
+      </w:pPr>
+      <w:r>
         <w:t xml:space="preserve">    il.Emit(OpCodes.Ldc_I4_1);</w:t>
       </w:r>
     </w:p>
     <w:p>
       <w:pPr>
-        <w:spacing w:line="240" w:lineRule="auto"/>
-      </w:pPr>
-      <w:r>
-        <w:rPr>
-          <w:i/>
-          <w:sz w:val="24"/>
-        </w:rPr>
+        <w:pStyle w:val="Listing"/>
+      </w:pPr>
+      <w:r>
         <w:t xml:space="preserve">    il.Emit(OpCodes.Bgt, recurse);</w:t>
       </w:r>
     </w:p>
     <w:p>
       <w:pPr>
-        <w:spacing w:line="240" w:lineRule="auto"/>
-      </w:pPr>
-    </w:p>
-    <w:p>
-      <w:pPr>
-        <w:spacing w:line="240" w:lineRule="auto"/>
-      </w:pPr>
-      <w:r>
-        <w:rPr>
-          <w:i/>
-          <w:sz w:val="24"/>
-        </w:rPr>
+        <w:pStyle w:val="Listing"/>
+      </w:pPr>
+    </w:p>
+    <w:p>
+      <w:pPr>
+        <w:pStyle w:val="Listing"/>
+      </w:pPr>
+      <w:r>
         <w:t xml:space="preserve">    // return 1;</w:t>
       </w:r>
     </w:p>
     <w:p>
       <w:pPr>
-        <w:spacing w:line="240" w:lineRule="auto"/>
-      </w:pPr>
-      <w:r>
-        <w:rPr>
-          <w:i/>
-          <w:sz w:val="24"/>
-        </w:rPr>
+        <w:pStyle w:val="Listing"/>
+      </w:pPr>
+      <w:r>
         <w:t xml:space="preserve">    il.Emit(OpCodes.Ldc_I4_1);</w:t>
       </w:r>
     </w:p>
     <w:p>
       <w:pPr>
-        <w:spacing w:line="240" w:lineRule="auto"/>
-      </w:pPr>
-      <w:r>
-        <w:rPr>
-          <w:i/>
-          <w:sz w:val="24"/>
-        </w:rPr>
+        <w:pStyle w:val="Listing"/>
+      </w:pPr>
+      <w:r>
         <w:t xml:space="preserve">    il.Emit(OpCodes.Ret);</w:t>
       </w:r>
     </w:p>
     <w:p>
       <w:pPr>
-        <w:spacing w:line="240" w:lineRule="auto"/>
-      </w:pPr>
-    </w:p>
-    <w:p>
-      <w:pPr>
-        <w:spacing w:line="240" w:lineRule="auto"/>
-      </w:pPr>
-      <w:r>
-        <w:rPr>
-          <w:i/>
-          <w:sz w:val="24"/>
-        </w:rPr>
+        <w:pStyle w:val="Listing"/>
+      </w:pPr>
+    </w:p>
+    <w:p>
+      <w:pPr>
+        <w:pStyle w:val="Listing"/>
+      </w:pPr>
+      <w:r>
         <w:t xml:space="preserve">    // recurse: return n * Factorial(n - 1);</w:t>
       </w:r>
     </w:p>
     <w:p>
       <w:pPr>
-        <w:spacing w:line="240" w:lineRule="auto"/>
-      </w:pPr>
-      <w:r>
-        <w:rPr>
-          <w:i/>
-          <w:sz w:val="24"/>
-        </w:rPr>
+        <w:pStyle w:val="Listing"/>
+      </w:pPr>
+      <w:r>
         <w:t xml:space="preserve">    il.MarkLabel(recurse);</w:t>
       </w:r>
     </w:p>
     <w:p>
       <w:pPr>
-        <w:spacing w:line="240" w:lineRule="auto"/>
-      </w:pPr>
-      <w:r>
-        <w:rPr>
-          <w:i/>
-          <w:sz w:val="24"/>
-        </w:rPr>
+        <w:pStyle w:val="Listing"/>
+      </w:pPr>
+      <w:r>
         <w:t xml:space="preserve">    il.Emit(OpCodes.Ldarg_0);</w:t>
       </w:r>
     </w:p>
     <w:p>
       <w:pPr>
-        <w:spacing w:line="240" w:lineRule="auto"/>
-      </w:pPr>
-      <w:r>
-        <w:rPr>
-          <w:i/>
-          <w:sz w:val="24"/>
-        </w:rPr>
-        <w:t xml:space="preserve">    il.Emit(</w:t>
-      </w:r>
-      <w:r>
-        <w:rPr>
-          <w:i/>
-          <w:sz w:val="24"/>
-        </w:rPr>
-        <w:t>OpCodes.Ldarg_0);</w:t>
-      </w:r>
-    </w:p>
-    <w:p>
-      <w:pPr>
-        <w:spacing w:line="240" w:lineRule="auto"/>
-      </w:pPr>
-      <w:r>
-        <w:rPr>
-          <w:i/>
-          <w:sz w:val="24"/>
-        </w:rPr>
+        <w:pStyle w:val="Listing"/>
+      </w:pPr>
+      <w:r>
+        <w:t xml:space="preserve">    il.Emit(OpCodes.Ldarg_0);</w:t>
+      </w:r>
+    </w:p>
+    <w:p>
+      <w:pPr>
+        <w:pStyle w:val="Listing"/>
+      </w:pPr>
+      <w:r>
         <w:t xml:space="preserve">    il.Emit(OpCodes.Ldc_I4_1);</w:t>
       </w:r>
     </w:p>
     <w:p>
       <w:pPr>
-        <w:spacing w:line="240" w:lineRule="auto"/>
-      </w:pPr>
-      <w:r>
-        <w:rPr>
-          <w:i/>
-          <w:sz w:val="24"/>
-        </w:rPr>
+        <w:pStyle w:val="Listing"/>
+      </w:pPr>
+      <w:r>
         <w:t xml:space="preserve">    il.Emit(OpCodes.Sub);</w:t>
       </w:r>
     </w:p>
     <w:p>
       <w:pPr>
-        <w:spacing w:line="240" w:lineRule="auto"/>
-      </w:pPr>
-      <w:r>
-        <w:rPr>
-          <w:i/>
-          <w:sz w:val="24"/>
-        </w:rPr>
+        <w:pStyle w:val="Listing"/>
+      </w:pPr>
+      <w:r>
         <w:t xml:space="preserve">    il.Emit(OpCodes.Call, dynamicMethod);   // рекурсивный вызов самого метода</w:t>
       </w:r>
     </w:p>
     <w:p>
       <w:pPr>
-        <w:spacing w:line="240" w:lineRule="auto"/>
-      </w:pPr>
-      <w:r>
-        <w:rPr>
-          <w:i/>
-          <w:sz w:val="24"/>
-        </w:rPr>
+        <w:pStyle w:val="Listing"/>
+      </w:pPr>
+      <w:r>
         <w:t xml:space="preserve">    il.Emit(OpCodes.Mul);</w:t>
       </w:r>
     </w:p>
     <w:p>
       <w:pPr>
-        <w:spacing w:line="240" w:lineRule="auto"/>
-      </w:pPr>
-      <w:r>
-        <w:rPr>
-          <w:i/>
-          <w:sz w:val="24"/>
-        </w:rPr>
+        <w:pStyle w:val="Listing"/>
+      </w:pPr>
+      <w:r>
         <w:t xml:space="preserve">    il.Emit(OpCodes.Ret);</w:t>
       </w:r>
     </w:p>
     <w:p>
       <w:pPr>
-        <w:spacing w:line="240" w:lineRule="auto"/>
-      </w:pPr>
-    </w:p>
-    <w:p>
-      <w:pPr>
-        <w:spacing w:line="240" w:lineRule="auto"/>
-      </w:pPr>
-      <w:r>
-        <w:rPr>
-          <w:i/>
-          <w:sz w:val="24"/>
-        </w:rPr>
+        <w:pStyle w:val="Listing"/>
+      </w:pPr>
+    </w:p>
+    <w:p>
+      <w:pPr>
+        <w:pStyle w:val="Listing"/>
+      </w:pPr>
+      <w:r>
         <w:t xml:space="preserve">    return (Func&lt;int, int&gt;)dynamicMethod.CreateDelegate(typeof(Func&lt;int, int&gt;));</w:t>
       </w:r>
     </w:p>
     <w:p>
       <w:pPr>
-        <w:spacing w:line="240" w:lineRule="auto"/>
-      </w:pPr>
-      <w:r>
-        <w:rPr>
-          <w:i/>
-          <w:sz w:val="24"/>
-        </w:rPr>
+        <w:pStyle w:val="Listing"/>
+      </w:pPr>
+      <w:r>
         <w:t>}</w:t>
       </w:r>
     </w:p>
@@ -3467,495 +3284,330 @@
     </w:p>
     <w:p>
       <w:pPr>
-        <w:spacing w:line="240" w:lineRule="auto"/>
-      </w:pPr>
-      <w:r>
-        <w:rPr>
-          <w:i/>
-          <w:sz w:val="24"/>
-        </w:rPr>
+        <w:pStyle w:val="Listing"/>
+      </w:pPr>
+      <w:r>
         <w:t>// Задание 2.2: максимум из трёх чисел</w:t>
       </w:r>
     </w:p>
     <w:p>
       <w:pPr>
-        <w:spacing w:line="240" w:lineRule="auto"/>
-      </w:pPr>
-      <w:r>
-        <w:rPr>
-          <w:i/>
-          <w:sz w:val="24"/>
-        </w:rPr>
+        <w:pStyle w:val="Listing"/>
+      </w:pPr>
+      <w:r>
         <w:lastRenderedPageBreak/>
         <w:t>// int Max(int a, int b, int c) { int max = a; if (b &gt; max) max = b; if (c &gt; max) max = c; return max; }</w:t>
       </w:r>
     </w:p>
     <w:p>
       <w:pPr>
-        <w:spacing w:line="240" w:lineRule="auto"/>
-      </w:pPr>
-      <w:r>
-        <w:rPr>
-          <w:i/>
-          <w:sz w:val="24"/>
-        </w:rPr>
-        <w:t xml:space="preserve">public static Func&lt;int, </w:t>
-      </w:r>
-      <w:r>
-        <w:rPr>
-          <w:i/>
-          <w:sz w:val="24"/>
-        </w:rPr>
-        <w:t>int, int, int&gt; CreateMaxOfThreeMethod()</w:t>
-      </w:r>
-    </w:p>
-    <w:p>
-      <w:pPr>
-        <w:spacing w:line="240" w:lineRule="auto"/>
-      </w:pPr>
-      <w:r>
-        <w:rPr>
-          <w:i/>
-          <w:sz w:val="24"/>
-        </w:rPr>
+        <w:pStyle w:val="Listing"/>
+      </w:pPr>
+      <w:r>
+        <w:t>public static Func&lt;int, int, int, int&gt; CreateMaxOfThreeMethod()</w:t>
+      </w:r>
+    </w:p>
+    <w:p>
+      <w:pPr>
+        <w:pStyle w:val="Listing"/>
+      </w:pPr>
+      <w:r>
         <w:t>{</w:t>
       </w:r>
     </w:p>
     <w:p>
       <w:pPr>
-        <w:spacing w:line="240" w:lineRule="auto"/>
-      </w:pPr>
-      <w:r>
-        <w:rPr>
-          <w:i/>
-          <w:sz w:val="24"/>
-        </w:rPr>
+        <w:pStyle w:val="Listing"/>
+      </w:pPr>
+      <w:r>
         <w:t xml:space="preserve">    DynamicMethod dynamicMethod = new DynamicMethod(</w:t>
       </w:r>
     </w:p>
     <w:p>
       <w:pPr>
-        <w:spacing w:line="240" w:lineRule="auto"/>
-      </w:pPr>
-      <w:r>
-        <w:rPr>
-          <w:i/>
-          <w:sz w:val="24"/>
-        </w:rPr>
+        <w:pStyle w:val="Listing"/>
+      </w:pPr>
+      <w:r>
         <w:t xml:space="preserve">        "DynamicMax",</w:t>
       </w:r>
     </w:p>
     <w:p>
       <w:pPr>
-        <w:spacing w:line="240" w:lineRule="auto"/>
-      </w:pPr>
-      <w:r>
-        <w:rPr>
-          <w:i/>
-          <w:sz w:val="24"/>
-        </w:rPr>
+        <w:pStyle w:val="Listing"/>
+      </w:pPr>
+      <w:r>
         <w:t xml:space="preserve">        typeof(int),</w:t>
       </w:r>
     </w:p>
     <w:p>
       <w:pPr>
-        <w:spacing w:line="240" w:lineRule="auto"/>
-      </w:pPr>
-      <w:r>
-        <w:rPr>
-          <w:i/>
-          <w:sz w:val="24"/>
-        </w:rPr>
+        <w:pStyle w:val="Listing"/>
+      </w:pPr>
+      <w:r>
         <w:t xml:space="preserve">        new[] { typeof(int), typeof(int), typeof(int) },</w:t>
       </w:r>
     </w:p>
     <w:p>
       <w:pPr>
-        <w:spacing w:line="240" w:lineRule="auto"/>
-      </w:pPr>
-      <w:r>
-        <w:rPr>
-          <w:i/>
-          <w:sz w:val="24"/>
-        </w:rPr>
+        <w:pStyle w:val="Listing"/>
+      </w:pPr>
+      <w:r>
         <w:t xml:space="preserve">        typeof(ILGeneratorDemo).Module</w:t>
       </w:r>
     </w:p>
     <w:p>
       <w:pPr>
-        <w:spacing w:line="240" w:lineRule="auto"/>
-      </w:pPr>
-      <w:r>
-        <w:rPr>
-          <w:i/>
-          <w:sz w:val="24"/>
-        </w:rPr>
+        <w:pStyle w:val="Listing"/>
+      </w:pPr>
+      <w:r>
         <w:t xml:space="preserve">    );</w:t>
       </w:r>
     </w:p>
     <w:p>
       <w:pPr>
-        <w:spacing w:line="240" w:lineRule="auto"/>
-      </w:pPr>
-    </w:p>
-    <w:p>
-      <w:pPr>
-        <w:spacing w:line="240" w:lineRule="auto"/>
-      </w:pPr>
-      <w:r>
-        <w:rPr>
-          <w:i/>
-          <w:sz w:val="24"/>
-        </w:rPr>
+        <w:pStyle w:val="Listing"/>
+      </w:pPr>
+    </w:p>
+    <w:p>
+      <w:pPr>
+        <w:pStyle w:val="Listing"/>
+      </w:pPr>
+      <w:r>
         <w:t xml:space="preserve">    ILGenerator il = dynamicMethod.GetILGenerator();</w:t>
       </w:r>
     </w:p>
     <w:p>
       <w:pPr>
-        <w:spacing w:line="240" w:lineRule="auto"/>
-      </w:pPr>
-    </w:p>
-    <w:p>
-      <w:pPr>
-        <w:spacing w:line="240" w:lineRule="auto"/>
-      </w:pPr>
-      <w:r>
-        <w:rPr>
-          <w:i/>
-          <w:sz w:val="24"/>
-        </w:rPr>
+        <w:pStyle w:val="Listing"/>
+      </w:pPr>
+    </w:p>
+    <w:p>
+      <w:pPr>
+        <w:pStyle w:val="Listing"/>
+      </w:pPr>
+      <w:r>
         <w:t xml:space="preserve">    Label skipB = il.DefineLabel();</w:t>
       </w:r>
     </w:p>
     <w:p>
       <w:pPr>
-        <w:spacing w:line="240" w:lineRule="auto"/>
-      </w:pPr>
-      <w:r>
-        <w:rPr>
-          <w:i/>
-          <w:sz w:val="24"/>
-        </w:rPr>
+        <w:pStyle w:val="Listing"/>
+      </w:pPr>
+      <w:r>
         <w:t xml:space="preserve">    Label skipC = il.DefineLabel();</w:t>
       </w:r>
     </w:p>
     <w:p>
       <w:pPr>
-        <w:spacing w:line="240" w:lineRule="auto"/>
-      </w:pPr>
-    </w:p>
-    <w:p>
-      <w:pPr>
-        <w:spacing w:line="240" w:lineRule="auto"/>
-      </w:pPr>
-      <w:r>
-        <w:rPr>
-          <w:i/>
-          <w:sz w:val="24"/>
-        </w:rPr>
+        <w:pStyle w:val="Listing"/>
+      </w:pPr>
+    </w:p>
+    <w:p>
+      <w:pPr>
+        <w:pStyle w:val="Listing"/>
+      </w:pPr>
+      <w:r>
         <w:t xml:space="preserve">    il.DeclareLocal(typeof(int)); // max</w:t>
       </w:r>
     </w:p>
     <w:p>
       <w:pPr>
-        <w:spacing w:line="240" w:lineRule="auto"/>
-      </w:pPr>
-    </w:p>
-    <w:p>
-      <w:pPr>
-        <w:spacing w:line="240" w:lineRule="auto"/>
-      </w:pPr>
-      <w:r>
-        <w:rPr>
-          <w:i/>
-          <w:sz w:val="24"/>
-        </w:rPr>
+        <w:pStyle w:val="Listing"/>
+      </w:pPr>
+    </w:p>
+    <w:p>
+      <w:pPr>
+        <w:pStyle w:val="Listing"/>
+      </w:pPr>
+      <w:r>
         <w:t xml:space="preserve">    // max = a;</w:t>
       </w:r>
     </w:p>
     <w:p>
       <w:pPr>
-        <w:spacing w:line="240" w:lineRule="auto"/>
-      </w:pPr>
-      <w:r>
-        <w:rPr>
-          <w:i/>
-          <w:sz w:val="24"/>
-        </w:rPr>
+        <w:pStyle w:val="Listing"/>
+      </w:pPr>
+      <w:r>
         <w:t xml:space="preserve">    il.Emit(OpCodes.Ldarg_0);</w:t>
       </w:r>
     </w:p>
     <w:p>
       <w:pPr>
-        <w:spacing w:line="240" w:lineRule="auto"/>
-      </w:pPr>
-      <w:r>
-        <w:rPr>
-          <w:i/>
-          <w:sz w:val="24"/>
-        </w:rPr>
+        <w:pStyle w:val="Listing"/>
+      </w:pPr>
+      <w:r>
         <w:t xml:space="preserve">    il.Emit(OpCodes.Stloc_0);</w:t>
       </w:r>
     </w:p>
     <w:p>
       <w:pPr>
-        <w:spacing w:line="240" w:lineRule="auto"/>
-      </w:pPr>
-    </w:p>
-    <w:p>
-      <w:pPr>
-        <w:spacing w:line="240" w:lineRule="auto"/>
-      </w:pPr>
-      <w:r>
-        <w:rPr>
-          <w:i/>
-          <w:sz w:val="24"/>
-        </w:rPr>
-        <w:t xml:space="preserve">    // if (b &lt;= max) </w:t>
-      </w:r>
-      <w:r>
-        <w:rPr>
-          <w:i/>
-          <w:sz w:val="24"/>
-        </w:rPr>
-        <w:t>goto skipB; max = b;</w:t>
-      </w:r>
-    </w:p>
-    <w:p>
-      <w:pPr>
-        <w:spacing w:line="240" w:lineRule="auto"/>
-      </w:pPr>
-      <w:r>
-        <w:rPr>
-          <w:i/>
-          <w:sz w:val="24"/>
-        </w:rPr>
+        <w:pStyle w:val="Listing"/>
+      </w:pPr>
+    </w:p>
+    <w:p>
+      <w:pPr>
+        <w:pStyle w:val="Listing"/>
+      </w:pPr>
+      <w:r>
+        <w:t xml:space="preserve">    // if (b &lt;= max) goto skipB; max = b;</w:t>
+      </w:r>
+    </w:p>
+    <w:p>
+      <w:pPr>
+        <w:pStyle w:val="Listing"/>
+      </w:pPr>
+      <w:r>
         <w:t xml:space="preserve">    il.Emit(OpCodes.Ldarg_1);</w:t>
       </w:r>
     </w:p>
     <w:p>
       <w:pPr>
-        <w:spacing w:line="240" w:lineRule="auto"/>
-      </w:pPr>
-      <w:r>
-        <w:rPr>
-          <w:i/>
-          <w:sz w:val="24"/>
-        </w:rPr>
+        <w:pStyle w:val="Listing"/>
+      </w:pPr>
+      <w:r>
         <w:t xml:space="preserve">    il.Emit(OpCodes.Ldloc_0);</w:t>
       </w:r>
     </w:p>
     <w:p>
       <w:pPr>
-        <w:spacing w:line="240" w:lineRule="auto"/>
-      </w:pPr>
-      <w:r>
-        <w:rPr>
-          <w:i/>
-          <w:sz w:val="24"/>
-        </w:rPr>
+        <w:pStyle w:val="Listing"/>
+      </w:pPr>
+      <w:r>
         <w:t xml:space="preserve">    il.Emit(OpCodes.Ble, skipB);</w:t>
       </w:r>
     </w:p>
     <w:p>
       <w:pPr>
-        <w:spacing w:line="240" w:lineRule="auto"/>
-      </w:pPr>
-      <w:r>
-        <w:rPr>
-          <w:i/>
-          <w:sz w:val="24"/>
-        </w:rPr>
+        <w:pStyle w:val="Listing"/>
+      </w:pPr>
+      <w:r>
         <w:t xml:space="preserve">    il.Emit(OpCodes.Ldarg_1);</w:t>
       </w:r>
     </w:p>
     <w:p>
       <w:pPr>
-        <w:spacing w:line="240" w:lineRule="auto"/>
-      </w:pPr>
-      <w:r>
-        <w:rPr>
-          <w:i/>
-          <w:sz w:val="24"/>
-        </w:rPr>
+        <w:pStyle w:val="Listing"/>
+      </w:pPr>
+      <w:r>
         <w:t xml:space="preserve">    il.Emit(OpCodes.Stloc_0);</w:t>
       </w:r>
     </w:p>
     <w:p>
       <w:pPr>
-        <w:spacing w:line="240" w:lineRule="auto"/>
-      </w:pPr>
-      <w:r>
-        <w:rPr>
-          <w:i/>
-          <w:sz w:val="24"/>
-        </w:rPr>
+        <w:pStyle w:val="Listing"/>
+      </w:pPr>
+      <w:r>
         <w:t xml:space="preserve">    il.MarkLabel(skipB);</w:t>
       </w:r>
     </w:p>
     <w:p>
       <w:pPr>
-        <w:spacing w:line="240" w:lineRule="auto"/>
-      </w:pPr>
-    </w:p>
-    <w:p>
-      <w:pPr>
-        <w:spacing w:line="240" w:lineRule="auto"/>
-      </w:pPr>
-      <w:r>
-        <w:rPr>
-          <w:i/>
-          <w:sz w:val="24"/>
-        </w:rPr>
+        <w:pStyle w:val="Listing"/>
+      </w:pPr>
+    </w:p>
+    <w:p>
+      <w:pPr>
+        <w:pStyle w:val="Listing"/>
+      </w:pPr>
+      <w:r>
         <w:t xml:space="preserve">    // if (c &lt;= max) goto skipC; max = c;</w:t>
       </w:r>
     </w:p>
     <w:p>
       <w:pPr>
-        <w:spacing w:line="240" w:lineRule="auto"/>
-      </w:pPr>
-      <w:r>
-        <w:rPr>
-          <w:i/>
-          <w:sz w:val="24"/>
-        </w:rPr>
+        <w:pStyle w:val="Listing"/>
+      </w:pPr>
+      <w:r>
         <w:t xml:space="preserve">    il.Emit(OpCodes.Ldarg_2);</w:t>
       </w:r>
     </w:p>
     <w:p>
       <w:pPr>
-        <w:spacing w:line="240" w:lineRule="auto"/>
-      </w:pPr>
-      <w:r>
-        <w:rPr>
-          <w:i/>
-          <w:sz w:val="24"/>
-        </w:rPr>
+        <w:pStyle w:val="Listing"/>
+      </w:pPr>
+      <w:r>
         <w:t xml:space="preserve">    il.Emit(OpCodes.Ldloc_0);</w:t>
       </w:r>
     </w:p>
     <w:p>
       <w:pPr>
-        <w:spacing w:line="240" w:lineRule="auto"/>
-      </w:pPr>
-      <w:r>
-        <w:rPr>
-          <w:i/>
-          <w:sz w:val="24"/>
-        </w:rPr>
+        <w:pStyle w:val="Listing"/>
+      </w:pPr>
+      <w:r>
         <w:t xml:space="preserve">    il.Emit(OpCodes.Ble, skipC);</w:t>
       </w:r>
     </w:p>
     <w:p>
       <w:pPr>
-        <w:spacing w:line="240" w:lineRule="auto"/>
-      </w:pPr>
-      <w:r>
-        <w:rPr>
-          <w:i/>
-          <w:sz w:val="24"/>
-        </w:rPr>
+        <w:pStyle w:val="Listing"/>
+      </w:pPr>
+      <w:r>
         <w:t xml:space="preserve">    il.Emit(OpCodes.Ldarg_2);</w:t>
       </w:r>
     </w:p>
     <w:p>
       <w:pPr>
-        <w:spacing w:line="240" w:lineRule="auto"/>
-      </w:pPr>
-      <w:r>
-        <w:rPr>
-          <w:i/>
-          <w:sz w:val="24"/>
-        </w:rPr>
+        <w:pStyle w:val="Listing"/>
+      </w:pPr>
+      <w:r>
         <w:t xml:space="preserve">    il.Emit(OpCodes.Stloc_0);</w:t>
       </w:r>
     </w:p>
     <w:p>
       <w:pPr>
-        <w:spacing w:line="240" w:lineRule="auto"/>
-      </w:pPr>
-      <w:r>
-        <w:rPr>
-          <w:i/>
-          <w:sz w:val="24"/>
-        </w:rPr>
+        <w:pStyle w:val="Listing"/>
+      </w:pPr>
+      <w:r>
         <w:t xml:space="preserve">    il.MarkLabel(skipC);</w:t>
       </w:r>
     </w:p>
     <w:p>
       <w:pPr>
-        <w:spacing w:line="240" w:lineRule="auto"/>
-      </w:pPr>
-    </w:p>
-    <w:p>
-      <w:pPr>
-        <w:spacing w:line="240" w:lineRule="auto"/>
-      </w:pPr>
-      <w:r>
-        <w:rPr>
-          <w:i/>
-          <w:sz w:val="24"/>
-        </w:rPr>
+        <w:pStyle w:val="Listing"/>
+      </w:pPr>
+    </w:p>
+    <w:p>
+      <w:pPr>
+        <w:pStyle w:val="Listing"/>
+      </w:pPr>
+      <w:r>
         <w:t xml:space="preserve">    // return max;</w:t>
       </w:r>
     </w:p>
     <w:p>
       <w:pPr>
-        <w:spacing w:line="240" w:lineRule="auto"/>
-      </w:pPr>
-      <w:r>
-        <w:rPr>
-          <w:i/>
-          <w:sz w:val="24"/>
-        </w:rPr>
+        <w:pStyle w:val="Listing"/>
+      </w:pPr>
+      <w:r>
         <w:t xml:space="preserve">    il.Emit(OpCodes.Ldloc_0);</w:t>
       </w:r>
     </w:p>
     <w:p>
       <w:pPr>
-        <w:spacing w:line="240" w:lineRule="auto"/>
-      </w:pPr>
-      <w:r>
-        <w:rPr>
-          <w:i/>
-          <w:sz w:val="24"/>
-        </w:rPr>
+        <w:pStyle w:val="Listing"/>
+      </w:pPr>
+      <w:r>
         <w:t xml:space="preserve">    il.Emit(OpCodes.Ret);</w:t>
       </w:r>
     </w:p>
     <w:p>
       <w:pPr>
-        <w:spacing w:line="240" w:lineRule="auto"/>
-      </w:pPr>
-    </w:p>
-    <w:p>
-      <w:pPr>
-        <w:spacing w:line="240" w:lineRule="auto"/>
-      </w:pPr>
-      <w:r>
-        <w:rPr>
-          <w:i/>
-          <w:sz w:val="24"/>
-        </w:rPr>
-        <w:t xml:space="preserve">    return (</w:t>
-      </w:r>
-      <w:r>
-        <w:rPr>
-          <w:i/>
-          <w:sz w:val="24"/>
-        </w:rPr>
-        <w:t>Func&lt;int, int, int, int&gt;)dynamicMethod.CreateDelegate(typeof(Func&lt;int, int, int, int&gt;));</w:t>
-      </w:r>
-    </w:p>
-    <w:p>
-      <w:pPr>
-        <w:spacing w:line="240" w:lineRule="auto"/>
-      </w:pPr>
-      <w:r>
-        <w:rPr>
-          <w:i/>
-          <w:sz w:val="24"/>
-        </w:rPr>
+        <w:pStyle w:val="Listing"/>
+      </w:pPr>
+    </w:p>
+    <w:p>
+      <w:pPr>
+        <w:pStyle w:val="Listing"/>
+      </w:pPr>
+      <w:r>
+        <w:t xml:space="preserve">    return (Func&lt;int, int, int, int&gt;)dynamicMethod.CreateDelegate(typeof(Func&lt;int, int, int, int&gt;));</w:t>
+      </w:r>
+    </w:p>
+    <w:p>
+      <w:pPr>
+        <w:pStyle w:val="Listing"/>
+      </w:pPr>
+      <w:r>
         <w:t>}</w:t>
       </w:r>
     </w:p>
@@ -3981,7 +3633,7 @@
         </w:rPr>
         <w:lastRenderedPageBreak/>
         <w:drawing>
-          <wp:inline distT="0" distB="0" distL="0" distR="0" wp14:anchorId="4D3C1F41" wp14:editId="1687D50F">
+          <wp:inline distT="0" distB="0" distL="0" distR="0" wp14:anchorId="68E31584" wp14:editId="6ABD6A94">
             <wp:extent cx="5580000" cy="1646913"/>
             <wp:effectExtent l="0" t="0" r="0" b="0"/>
             <wp:docPr id="4" name="Picture 4"/>
@@ -4060,7 +3712,7 @@
         <w:spacing w:before="360"/>
         <w:ind w:firstLine="709"/>
       </w:pPr>
-      <w:bookmarkStart w:id="8" w:name="_Toc242378545"/>
+      <w:bookmarkStart w:id="8" w:name="_Toc242385940"/>
       <w:r>
         <w:rPr>
           <w:rFonts w:ascii="Times New Roman" w:hAnsi="Times New Roman"/>
@@ -4117,293 +3769,195 @@
     </w:p>
     <w:p>
       <w:pPr>
-        <w:spacing w:line="240" w:lineRule="auto"/>
-      </w:pPr>
-      <w:r>
-        <w:rPr>
-          <w:i/>
-          <w:sz w:val="24"/>
-        </w:rPr>
+        <w:pStyle w:val="Listing"/>
+      </w:pPr>
+      <w:r>
         <w:t>[MemoryDiagnoser]</w:t>
       </w:r>
     </w:p>
     <w:p>
       <w:pPr>
-        <w:spacing w:line="240" w:lineRule="auto"/>
-      </w:pPr>
-      <w:r>
-        <w:rPr>
-          <w:i/>
-          <w:sz w:val="24"/>
-        </w:rPr>
+        <w:pStyle w:val="Listing"/>
+      </w:pPr>
+      <w:r>
         <w:t>[ShortRunJob]</w:t>
       </w:r>
     </w:p>
     <w:p>
       <w:pPr>
-        <w:spacing w:line="240" w:lineRule="auto"/>
-      </w:pPr>
-      <w:r>
-        <w:rPr>
-          <w:i/>
-          <w:sz w:val="24"/>
-        </w:rPr>
+        <w:pStyle w:val="Listing"/>
+      </w:pPr>
+      <w:r>
         <w:t>public class FactorialAnalyzer</w:t>
       </w:r>
     </w:p>
     <w:p>
       <w:pPr>
-        <w:spacing w:line="240" w:lineRule="auto"/>
-      </w:pPr>
-      <w:r>
-        <w:rPr>
-          <w:i/>
-          <w:sz w:val="24"/>
-        </w:rPr>
+        <w:pStyle w:val="Listing"/>
+      </w:pPr>
+      <w:r>
         <w:t>{</w:t>
       </w:r>
     </w:p>
     <w:p>
       <w:pPr>
-        <w:spacing w:line="240" w:lineRule="auto"/>
-      </w:pPr>
-      <w:r>
-        <w:rPr>
-          <w:i/>
-          <w:sz w:val="24"/>
-        </w:rPr>
+        <w:pStyle w:val="Listing"/>
+      </w:pPr>
+      <w:r>
         <w:t xml:space="preserve">    private Func&lt;int, int&gt; _dynamicFactorial = null!;</w:t>
       </w:r>
     </w:p>
     <w:p>
       <w:pPr>
-        <w:spacing w:line="240" w:lineRule="auto"/>
-      </w:pPr>
-      <w:r>
-        <w:rPr>
-          <w:i/>
-          <w:sz w:val="24"/>
-        </w:rPr>
-        <w:t xml:space="preserve">    private Func&lt;int, int&gt; _</w:t>
-      </w:r>
-      <w:r>
-        <w:rPr>
-          <w:i/>
-          <w:sz w:val="24"/>
-        </w:rPr>
-        <w:t>dynamicRecursiveFactorial = null!;</w:t>
-      </w:r>
-    </w:p>
-    <w:p>
-      <w:pPr>
-        <w:spacing w:line="240" w:lineRule="auto"/>
-      </w:pPr>
-      <w:r>
-        <w:rPr>
-          <w:i/>
-          <w:sz w:val="24"/>
-        </w:rPr>
+        <w:pStyle w:val="Listing"/>
+      </w:pPr>
+      <w:r>
+        <w:t xml:space="preserve">    private Func&lt;int, int&gt; _dynamicRecursiveFactorial = null!;</w:t>
+      </w:r>
+    </w:p>
+    <w:p>
+      <w:pPr>
+        <w:pStyle w:val="Listing"/>
+      </w:pPr>
+      <w:r>
         <w:t xml:space="preserve">    private int _n = 10;</w:t>
       </w:r>
     </w:p>
     <w:p>
       <w:pPr>
-        <w:spacing w:line="240" w:lineRule="auto"/>
-      </w:pPr>
-    </w:p>
-    <w:p>
-      <w:pPr>
-        <w:spacing w:line="240" w:lineRule="auto"/>
-      </w:pPr>
-      <w:r>
-        <w:rPr>
-          <w:i/>
-          <w:sz w:val="24"/>
-        </w:rPr>
+        <w:pStyle w:val="Listing"/>
+      </w:pPr>
+    </w:p>
+    <w:p>
+      <w:pPr>
+        <w:pStyle w:val="Listing"/>
+      </w:pPr>
+      <w:r>
         <w:t xml:space="preserve">    [GlobalSetup]</w:t>
       </w:r>
     </w:p>
     <w:p>
       <w:pPr>
-        <w:spacing w:line="240" w:lineRule="auto"/>
-      </w:pPr>
-      <w:r>
-        <w:rPr>
-          <w:i/>
-          <w:sz w:val="24"/>
-        </w:rPr>
+        <w:pStyle w:val="Listing"/>
+      </w:pPr>
+      <w:r>
         <w:t xml:space="preserve">    public void Setup()</w:t>
       </w:r>
     </w:p>
     <w:p>
       <w:pPr>
-        <w:spacing w:line="240" w:lineRule="auto"/>
-      </w:pPr>
-      <w:r>
-        <w:rPr>
-          <w:i/>
-          <w:sz w:val="24"/>
-        </w:rPr>
+        <w:pStyle w:val="Listing"/>
+      </w:pPr>
+      <w:r>
         <w:t xml:space="preserve">    {</w:t>
       </w:r>
     </w:p>
     <w:p>
       <w:pPr>
-        <w:spacing w:line="240" w:lineRule="auto"/>
-      </w:pPr>
-      <w:r>
-        <w:rPr>
-          <w:i/>
-          <w:sz w:val="24"/>
-        </w:rPr>
+        <w:pStyle w:val="Listing"/>
+      </w:pPr>
+      <w:r>
         <w:t xml:space="preserve">        _dynamicFactorial = ILGeneratorDemo.CreateFactorialMethod();</w:t>
       </w:r>
     </w:p>
     <w:p>
       <w:pPr>
-        <w:spacing w:line="240" w:lineRule="auto"/>
-      </w:pPr>
-      <w:r>
-        <w:rPr>
-          <w:i/>
-          <w:sz w:val="24"/>
-        </w:rPr>
+        <w:pStyle w:val="Listing"/>
+      </w:pPr>
+      <w:r>
         <w:t xml:space="preserve">        _dynamicRecursiveFactorial = ILGeneratorDemo.CreateRecursiveFactorialMethod();</w:t>
       </w:r>
     </w:p>
     <w:p>
       <w:pPr>
-        <w:spacing w:line="240" w:lineRule="auto"/>
-      </w:pPr>
-      <w:r>
-        <w:rPr>
-          <w:i/>
-          <w:sz w:val="24"/>
-        </w:rPr>
+        <w:pStyle w:val="Listing"/>
+      </w:pPr>
+      <w:r>
         <w:t xml:space="preserve">    }</w:t>
       </w:r>
     </w:p>
     <w:p>
       <w:pPr>
-        <w:spacing w:line="240" w:lineRule="auto"/>
-      </w:pPr>
-    </w:p>
-    <w:p>
-      <w:pPr>
-        <w:spacing w:line="240" w:lineRule="auto"/>
-      </w:pPr>
-      <w:r>
-        <w:rPr>
-          <w:i/>
-          <w:sz w:val="24"/>
-        </w:rPr>
+        <w:pStyle w:val="Listing"/>
+      </w:pPr>
+    </w:p>
+    <w:p>
+      <w:pPr>
+        <w:pStyle w:val="Listing"/>
+      </w:pPr>
+      <w:r>
         <w:t xml:space="preserve">    [Benchmark(Baseline = true)]</w:t>
       </w:r>
     </w:p>
     <w:p>
       <w:pPr>
-        <w:spacing w:line="240" w:lineRule="auto"/>
-      </w:pPr>
-      <w:r>
-        <w:rPr>
-          <w:i/>
-          <w:sz w:val="24"/>
-        </w:rPr>
+        <w:pStyle w:val="Listing"/>
+      </w:pPr>
+      <w:r>
         <w:t xml:space="preserve">    public int CSharpRecursive() =&gt; Factorial(_n);</w:t>
       </w:r>
     </w:p>
     <w:p>
       <w:pPr>
-        <w:spacing w:line="240" w:lineRule="auto"/>
-      </w:pPr>
-    </w:p>
-    <w:p>
-      <w:pPr>
-        <w:spacing w:line="240" w:lineRule="auto"/>
-      </w:pPr>
-      <w:r>
-        <w:rPr>
-          <w:i/>
-          <w:sz w:val="24"/>
-        </w:rPr>
+        <w:pStyle w:val="Listing"/>
+      </w:pPr>
+    </w:p>
+    <w:p>
+      <w:pPr>
+        <w:pStyle w:val="Listing"/>
+      </w:pPr>
+      <w:r>
         <w:t xml:space="preserve">    [Benchmark]</w:t>
       </w:r>
     </w:p>
     <w:p>
       <w:pPr>
-        <w:spacing w:line="240" w:lineRule="auto"/>
-      </w:pPr>
-      <w:r>
-        <w:rPr>
-          <w:i/>
-          <w:sz w:val="24"/>
-        </w:rPr>
+        <w:pStyle w:val="Listing"/>
+      </w:pPr>
+      <w:r>
         <w:t xml:space="preserve">    public int DynamicLoop() =&gt; _dynamicFactorial(_n);</w:t>
       </w:r>
     </w:p>
     <w:p>
       <w:pPr>
-        <w:spacing w:line="240" w:lineRule="auto"/>
-      </w:pPr>
-    </w:p>
-    <w:p>
-      <w:pPr>
-        <w:spacing w:line="240" w:lineRule="auto"/>
-      </w:pPr>
-      <w:r>
-        <w:rPr>
-          <w:i/>
-          <w:sz w:val="24"/>
-        </w:rPr>
+        <w:pStyle w:val="Listing"/>
+      </w:pPr>
+    </w:p>
+    <w:p>
+      <w:pPr>
+        <w:pStyle w:val="Listing"/>
+      </w:pPr>
+      <w:r>
+        <w:t xml:space="preserve">    [Benchmark]</w:t>
+      </w:r>
+    </w:p>
+    <w:p>
+      <w:pPr>
+        <w:pStyle w:val="Listing"/>
+      </w:pPr>
+      <w:r>
         <w:lastRenderedPageBreak/>
-        <w:t xml:space="preserve">    [Benchmark]</w:t>
-      </w:r>
-    </w:p>
-    <w:p>
-      <w:pPr>
-        <w:spacing w:line="240" w:lineRule="auto"/>
-      </w:pPr>
-      <w:r>
-        <w:rPr>
-          <w:i/>
-          <w:sz w:val="24"/>
-        </w:rPr>
-        <w:t xml:space="preserve">    public int DynamicRecursive() =&gt; _dynamicRecursiveFactorial(_n</w:t>
-      </w:r>
-      <w:r>
-        <w:rPr>
-          <w:i/>
-          <w:sz w:val="24"/>
-        </w:rPr>
-        <w:t>);</w:t>
-      </w:r>
-    </w:p>
-    <w:p>
-      <w:pPr>
-        <w:spacing w:line="240" w:lineRule="auto"/>
-      </w:pPr>
-    </w:p>
-    <w:p>
-      <w:pPr>
-        <w:spacing w:line="240" w:lineRule="auto"/>
-      </w:pPr>
-      <w:r>
-        <w:rPr>
-          <w:i/>
-          <w:sz w:val="24"/>
-        </w:rPr>
+        <w:t xml:space="preserve">    public int DynamicRecursive() =&gt; _dynamicRecursiveFactorial(_n);</w:t>
+      </w:r>
+    </w:p>
+    <w:p>
+      <w:pPr>
+        <w:pStyle w:val="Listing"/>
+      </w:pPr>
+    </w:p>
+    <w:p>
+      <w:pPr>
+        <w:pStyle w:val="Listing"/>
+      </w:pPr>
+      <w:r>
         <w:t xml:space="preserve">    private static int Factorial(int n) =&gt; n &lt;= 1 ? 1 : n * Factorial(n - 1);</w:t>
       </w:r>
     </w:p>
     <w:p>
       <w:pPr>
-        <w:spacing w:line="240" w:lineRule="auto"/>
-      </w:pPr>
-      <w:r>
-        <w:rPr>
-          <w:i/>
-          <w:sz w:val="24"/>
-        </w:rPr>
+        <w:pStyle w:val="Listing"/>
+      </w:pPr>
+      <w:r>
         <w:t>}</w:t>
       </w:r>
     </w:p>
@@ -4437,7 +3991,7 @@
           <w:noProof/>
         </w:rPr>
         <w:drawing>
-          <wp:inline distT="0" distB="0" distL="0" distR="0" wp14:anchorId="74056F1F" wp14:editId="0F84EDD4">
+          <wp:inline distT="0" distB="0" distL="0" distR="0" wp14:anchorId="7FAE92BE" wp14:editId="67408133">
             <wp:extent cx="5580000" cy="1482742"/>
             <wp:effectExtent l="0" t="0" r="0" b="0"/>
             <wp:docPr id="5" name="Picture 5"/>
@@ -4498,7 +4052,7 @@
         <w:jc w:val="both"/>
       </w:pPr>
       <w:r>
-        <w:t xml:space="preserve">Для факториала от 10 среднее время составило около 12,7 нс для метода на </w:t>
+        <w:t xml:space="preserve">Для факториала от 10 среднее время составило около 8,3 нс для рекурсивного метода на </w:t>
       </w:r>
       <w:r>
         <w:rPr>
@@ -4507,7 +4061,7 @@
         <w:t>C</w:t>
       </w:r>
       <w:r>
-        <w:t xml:space="preserve">#, 14,7 нс для динамического цикла и 30,1 нс для динамического рекурсивного метода. Для максимума из трех чисел динамический метод выполняется примерно за 2,5 нс, метод на </w:t>
+        <w:t xml:space="preserve">#, 5,1 нс для динамического цикла и 16,4 нс для динамического рекурсивного метода. Цикл быстрее рекурсии, так как не тратит время на вызов метода на каждом шаге. Для максимума из трех чисел динамический метод выполняется примерно за 2,0 нс, метод на </w:t>
       </w:r>
       <w:r>
         <w:rPr>
@@ -4516,7 +4070,16 @@
         <w:t>C</w:t>
       </w:r>
       <w:r>
-        <w:t xml:space="preserve"># – менее чем за 1 нс. Динамические методы вызываются через делегат, что добавляет накладные расходы. Выделения памяти нет ни в одном варианте. Погрешности измерений (столбец </w:t>
+        <w:t xml:space="preserve"># – менее чем за 0,1 нс, потому что </w:t>
+      </w:r>
+      <w:r>
+        <w:rPr>
+          <w:i/>
+        </w:rPr>
+        <w:t>JIT</w:t>
+      </w:r>
+      <w:r>
+        <w:t xml:space="preserve">-компилятор встраивает его в вызывающий код, а динамический метод вызывается через делегат. Выделения памяти нет ни в одном варианте. Погрешности измерений (столбец </w:t>
       </w:r>
       <w:r>
         <w:rPr>
@@ -4534,7 +4097,7 @@
         <w:spacing w:before="360"/>
         <w:ind w:firstLine="709"/>
       </w:pPr>
-      <w:bookmarkStart w:id="9" w:name="_Toc242378546"/>
+      <w:bookmarkStart w:id="9" w:name="_Toc242385941"/>
       <w:r>
         <w:rPr>
           <w:rFonts w:ascii="Times New Roman" w:hAnsi="Times New Roman"/>
@@ -4631,7 +4194,7 @@
         </w:rPr>
         <w:lastRenderedPageBreak/>
         <w:drawing>
-          <wp:inline distT="0" distB="0" distL="0" distR="0" wp14:anchorId="79A49157" wp14:editId="3968A0B4">
+          <wp:inline distT="0" distB="0" distL="0" distR="0" wp14:anchorId="30A97D3C" wp14:editId="71363C5D">
             <wp:extent cx="5580000" cy="2427029"/>
             <wp:effectExtent l="0" t="0" r="0" b="0"/>
             <wp:docPr id="6" name="Picture 6"/>
@@ -4698,7 +4261,7 @@
         <w:jc w:val="both"/>
       </w:pPr>
       <w:r>
-        <w:t xml:space="preserve">Обычный метод выполняется быстрее виртуального метода и вызова через делегат (56, 85 и 78 мс за 10 000 вызовов). Метод </w:t>
+        <w:t xml:space="preserve">Обычный метод выполняется быстрее виртуального метода и вызова через делегат (10, 44 и 31 мс за 10 000 вызовов). Метод </w:t>
       </w:r>
       <w:r>
         <w:rPr>
@@ -4739,7 +4302,7 @@
           <w:noProof/>
         </w:rPr>
         <w:drawing>
-          <wp:inline distT="0" distB="0" distL="0" distR="0" wp14:anchorId="7DE9FB05" wp14:editId="144FE2A9">
+          <wp:inline distT="0" distB="0" distL="0" distR="0" wp14:anchorId="48B6A642" wp14:editId="2215102A">
             <wp:extent cx="5580000" cy="2427029"/>
             <wp:effectExtent l="0" t="0" r="0" b="0"/>
             <wp:docPr id="7" name="Picture 7"/>
@@ -4818,7 +4381,7 @@
         <w:spacing w:before="360"/>
         <w:ind w:firstLine="709"/>
       </w:pPr>
-      <w:bookmarkStart w:id="10" w:name="_Toc242378547"/>
+      <w:bookmarkStart w:id="10" w:name="_Toc242385942"/>
       <w:r>
         <w:rPr>
           <w:rFonts w:ascii="Times New Roman" w:hAnsi="Times New Roman"/>
@@ -4880,388 +4443,261 @@
     </w:p>
     <w:p>
       <w:pPr>
-        <w:spacing w:line="240" w:lineRule="auto"/>
-      </w:pPr>
-      <w:r>
-        <w:rPr>
-          <w:i/>
-          <w:sz w:val="24"/>
-        </w:rPr>
+        <w:pStyle w:val="Listing"/>
+      </w:pPr>
+      <w:r>
         <w:t>// Задание 4.1: сложение элементов массива из 10000 целых чисел</w:t>
       </w:r>
     </w:p>
     <w:p>
       <w:pPr>
-        <w:spacing w:line="240" w:lineRule="auto"/>
-      </w:pPr>
-      <w:r>
-        <w:rPr>
-          <w:i/>
-          <w:sz w:val="24"/>
-        </w:rPr>
+        <w:pStyle w:val="Listing"/>
+      </w:pPr>
+      <w:r>
         <w:t>// Первый вызов включает JIT-компиляцию метода, последующие выполняют уже скомпилированный код</w:t>
       </w:r>
     </w:p>
     <w:p>
       <w:pPr>
-        <w:spacing w:line="240" w:lineRule="auto"/>
-      </w:pPr>
-      <w:r>
-        <w:rPr>
-          <w:i/>
-          <w:sz w:val="24"/>
-        </w:rPr>
+        <w:pStyle w:val="Listing"/>
+      </w:pPr>
+      <w:r>
         <w:t>static void ArraySumTask()</w:t>
       </w:r>
     </w:p>
     <w:p>
       <w:pPr>
-        <w:spacing w:line="240" w:lineRule="auto"/>
-      </w:pPr>
-      <w:r>
-        <w:rPr>
-          <w:i/>
-          <w:sz w:val="24"/>
-        </w:rPr>
+        <w:pStyle w:val="Listing"/>
+      </w:pPr>
+      <w:r>
         <w:t>{</w:t>
       </w:r>
     </w:p>
     <w:p>
       <w:pPr>
-        <w:spacing w:line="240" w:lineRule="auto"/>
-      </w:pPr>
-      <w:r>
-        <w:rPr>
-          <w:i/>
-          <w:sz w:val="24"/>
-        </w:rPr>
+        <w:pStyle w:val="Listing"/>
+      </w:pPr>
+      <w:r>
         <w:t xml:space="preserve">    Console.WriteLine("\n=== Задание 4.1: сумма элементов массива (10000 элементов) ===\n");</w:t>
       </w:r>
     </w:p>
     <w:p>
       <w:pPr>
-        <w:spacing w:line="240" w:lineRule="auto"/>
-      </w:pPr>
-    </w:p>
-    <w:p>
-      <w:pPr>
-        <w:spacing w:line="240" w:lineRule="auto"/>
-      </w:pPr>
-      <w:r>
-        <w:rPr>
-          <w:i/>
-          <w:sz w:val="24"/>
-        </w:rPr>
+        <w:pStyle w:val="Listing"/>
+      </w:pPr>
+    </w:p>
+    <w:p>
+      <w:pPr>
+        <w:pStyle w:val="Listing"/>
+      </w:pPr>
+      <w:r>
         <w:t xml:space="preserve">    int[] array = new int[10000];</w:t>
       </w:r>
     </w:p>
     <w:p>
       <w:pPr>
-        <w:spacing w:line="240" w:lineRule="auto"/>
-      </w:pPr>
-      <w:r>
-        <w:rPr>
-          <w:i/>
-          <w:sz w:val="24"/>
-        </w:rPr>
+        <w:pStyle w:val="Listing"/>
+      </w:pPr>
+      <w:r>
         <w:t xml:space="preserve">    for (int i = 0; i &lt; array.Length; i++)</w:t>
       </w:r>
     </w:p>
     <w:p>
       <w:pPr>
-        <w:spacing w:line="240" w:lineRule="auto"/>
-      </w:pPr>
-      <w:r>
-        <w:rPr>
-          <w:i/>
-          <w:sz w:val="24"/>
-        </w:rPr>
+        <w:pStyle w:val="Listing"/>
+      </w:pPr>
+      <w:r>
         <w:t xml:space="preserve">        array[i] = i;</w:t>
       </w:r>
     </w:p>
     <w:p>
       <w:pPr>
-        <w:spacing w:line="240" w:lineRule="auto"/>
-      </w:pPr>
-    </w:p>
-    <w:p>
-      <w:pPr>
-        <w:spacing w:line="240" w:lineRule="auto"/>
-      </w:pPr>
-      <w:r>
-        <w:rPr>
-          <w:i/>
-          <w:sz w:val="24"/>
-        </w:rPr>
+        <w:pStyle w:val="Listing"/>
+      </w:pPr>
+    </w:p>
+    <w:p>
+      <w:pPr>
+        <w:pStyle w:val="Listing"/>
+      </w:pPr>
+      <w:r>
         <w:t xml:space="preserve">    // Первый вызов: JIT-компиляция + выполнение</w:t>
       </w:r>
     </w:p>
     <w:p>
       <w:pPr>
-        <w:spacing w:line="240" w:lineRule="auto"/>
-      </w:pPr>
-      <w:r>
-        <w:rPr>
-          <w:i/>
-          <w:sz w:val="24"/>
-        </w:rPr>
+        <w:pStyle w:val="Listing"/>
+      </w:pPr>
+      <w:r>
         <w:t xml:space="preserve">    long start = Stopwatch.GetTimestamp();</w:t>
       </w:r>
     </w:p>
     <w:p>
       <w:pPr>
-        <w:spacing w:line="240" w:lineRule="auto"/>
-      </w:pPr>
-      <w:r>
-        <w:rPr>
-          <w:i/>
-          <w:sz w:val="24"/>
-        </w:rPr>
+        <w:pStyle w:val="Listing"/>
+      </w:pPr>
+      <w:r>
         <w:t xml:space="preserve">    long result = SumArray(array);</w:t>
       </w:r>
     </w:p>
     <w:p>
       <w:pPr>
-        <w:spacing w:line="240" w:lineRule="auto"/>
-      </w:pPr>
-      <w:r>
-        <w:rPr>
-          <w:i/>
-          <w:sz w:val="24"/>
-        </w:rPr>
+        <w:pStyle w:val="Listing"/>
+      </w:pPr>
+      <w:r>
         <w:t xml:space="preserve">    long firstCall = Stopwatch.GetTimestamp() - start;</w:t>
       </w:r>
     </w:p>
     <w:p>
       <w:pPr>
-        <w:spacing w:line="240" w:lineRule="auto"/>
-      </w:pPr>
-      <w:r>
-        <w:rPr>
-          <w:i/>
-          <w:sz w:val="24"/>
-        </w:rPr>
+        <w:pStyle w:val="Listing"/>
+      </w:pPr>
+      <w:r>
         <w:t xml:space="preserve">    Console.WriteLine($"Сумма = {result}");</w:t>
       </w:r>
     </w:p>
     <w:p>
       <w:pPr>
-        <w:spacing w:line="240" w:lineRule="auto"/>
-      </w:pPr>
-      <w:r>
-        <w:rPr>
-          <w:i/>
-          <w:sz w:val="24"/>
-        </w:rPr>
+        <w:pStyle w:val="Listing"/>
+      </w:pPr>
+      <w:r>
         <w:t xml:space="preserve">    Console.WriteLine($"Первый вызов (с JIT-компиляцией): {firstCall * 1_000_000.0 / Stopwatch.Frequency:F1} мкс");</w:t>
       </w:r>
     </w:p>
     <w:p>
       <w:pPr>
-        <w:spacing w:line="240" w:lineRule="auto"/>
-      </w:pPr>
-    </w:p>
-    <w:p>
-      <w:pPr>
-        <w:spacing w:line="240" w:lineRule="auto"/>
-      </w:pPr>
-      <w:r>
-        <w:rPr>
-          <w:i/>
-          <w:sz w:val="24"/>
-        </w:rPr>
+        <w:pStyle w:val="Listing"/>
+      </w:pPr>
+    </w:p>
+    <w:p>
+      <w:pPr>
+        <w:pStyle w:val="Listing"/>
+      </w:pPr>
+      <w:r>
         <w:t xml:space="preserve">    // Повторные вызовы: метод уже скомпилирован</w:t>
       </w:r>
     </w:p>
     <w:p>
       <w:pPr>
-        <w:spacing w:line="240" w:lineRule="auto"/>
-      </w:pPr>
-      <w:r>
-        <w:rPr>
-          <w:i/>
-          <w:sz w:val="24"/>
-        </w:rPr>
+        <w:pStyle w:val="Listing"/>
+      </w:pPr>
+      <w:r>
         <w:t xml:space="preserve">    const int calls = 1000;</w:t>
       </w:r>
     </w:p>
     <w:p>
       <w:pPr>
-        <w:spacing w:line="240" w:lineRule="auto"/>
-      </w:pPr>
-      <w:r>
-        <w:rPr>
-          <w:i/>
-          <w:sz w:val="24"/>
-        </w:rPr>
+        <w:pStyle w:val="Listing"/>
+      </w:pPr>
+      <w:r>
         <w:t xml:space="preserve">    start = Stopwatch.GetTimestamp();</w:t>
       </w:r>
     </w:p>
     <w:p>
       <w:pPr>
-        <w:spacing w:line="240" w:lineRule="auto"/>
-      </w:pPr>
-      <w:r>
-        <w:rPr>
-          <w:i/>
-          <w:sz w:val="24"/>
-        </w:rPr>
+        <w:pStyle w:val="Listing"/>
+      </w:pPr>
+      <w:r>
         <w:t xml:space="preserve">    for (int i = 0; i &lt; calls; i++)</w:t>
       </w:r>
     </w:p>
     <w:p>
       <w:pPr>
-        <w:spacing w:line="240" w:lineRule="auto"/>
-      </w:pPr>
-      <w:r>
-        <w:rPr>
-          <w:i/>
-          <w:sz w:val="24"/>
-        </w:rPr>
+        <w:pStyle w:val="Listing"/>
+      </w:pPr>
+      <w:r>
         <w:t xml:space="preserve">        SumArray(array);</w:t>
       </w:r>
     </w:p>
     <w:p>
       <w:pPr>
-        <w:spacing w:line="240" w:lineRule="auto"/>
-      </w:pPr>
-      <w:r>
-        <w:rPr>
-          <w:i/>
-          <w:sz w:val="24"/>
-        </w:rPr>
+        <w:pStyle w:val="Listing"/>
+      </w:pPr>
+      <w:r>
         <w:t xml:space="preserve">    long repeated = Stopwatch.GetTimestamp() - start;</w:t>
       </w:r>
     </w:p>
     <w:p>
       <w:pPr>
-        <w:spacing w:line="240" w:lineRule="auto"/>
-      </w:pPr>
-      <w:r>
-        <w:rPr>
-          <w:i/>
-          <w:sz w:val="24"/>
-        </w:rPr>
-        <w:t xml:space="preserve">    Console.WriteLine($"Повторный вызов (без JIT-компиляции): {</w:t>
-      </w:r>
-      <w:r>
-        <w:rPr>
-          <w:i/>
-          <w:sz w:val="24"/>
-        </w:rPr>
-        <w:t>repeated * 1_000_000.0 / Stopwatch.Frequency / calls:F1} мкс");</w:t>
-      </w:r>
-    </w:p>
-    <w:p>
-      <w:pPr>
-        <w:spacing w:line="240" w:lineRule="auto"/>
-      </w:pPr>
-      <w:r>
-        <w:rPr>
-          <w:i/>
-          <w:sz w:val="24"/>
-        </w:rPr>
+        <w:pStyle w:val="Listing"/>
+      </w:pPr>
+      <w:r>
+        <w:t xml:space="preserve">    Console.WriteLine($"Повторный вызов (без JIT-компиляции): {repeated * 1_000_000.0 / Stopwatch.Frequency / calls:F1} мкс");</w:t>
+      </w:r>
+    </w:p>
+    <w:p>
+      <w:pPr>
+        <w:pStyle w:val="Listing"/>
+      </w:pPr>
+      <w:r>
         <w:t>}</w:t>
       </w:r>
     </w:p>
     <w:p>
       <w:pPr>
-        <w:spacing w:line="240" w:lineRule="auto"/>
-      </w:pPr>
-    </w:p>
-    <w:p>
-      <w:pPr>
-        <w:spacing w:line="240" w:lineRule="auto"/>
-      </w:pPr>
-      <w:r>
-        <w:rPr>
-          <w:i/>
-          <w:sz w:val="24"/>
-        </w:rPr>
+        <w:pStyle w:val="Listing"/>
+      </w:pPr>
+    </w:p>
+    <w:p>
+      <w:pPr>
+        <w:pStyle w:val="Listing"/>
+      </w:pPr>
+      <w:r>
         <w:t>[MethodImpl(MethodImplOptions.NoInlining)]</w:t>
       </w:r>
     </w:p>
     <w:p>
       <w:pPr>
-        <w:spacing w:line="240" w:lineRule="auto"/>
-      </w:pPr>
-      <w:r>
-        <w:rPr>
-          <w:i/>
-          <w:sz w:val="24"/>
-        </w:rPr>
+        <w:pStyle w:val="Listing"/>
+      </w:pPr>
+      <w:r>
         <w:t>static long SumArray(int[] array)</w:t>
       </w:r>
     </w:p>
     <w:p>
       <w:pPr>
-        <w:spacing w:line="240" w:lineRule="auto"/>
-      </w:pPr>
-      <w:r>
-        <w:rPr>
-          <w:i/>
-          <w:sz w:val="24"/>
-        </w:rPr>
+        <w:pStyle w:val="Listing"/>
+      </w:pPr>
+      <w:r>
         <w:t>{</w:t>
       </w:r>
     </w:p>
     <w:p>
       <w:pPr>
-        <w:spacing w:line="240" w:lineRule="auto"/>
-      </w:pPr>
-      <w:r>
-        <w:rPr>
-          <w:i/>
-          <w:sz w:val="24"/>
-        </w:rPr>
+        <w:pStyle w:val="Listing"/>
+      </w:pPr>
+      <w:r>
         <w:t xml:space="preserve">    long sum = 0;</w:t>
       </w:r>
     </w:p>
     <w:p>
       <w:pPr>
-        <w:spacing w:line="240" w:lineRule="auto"/>
-      </w:pPr>
-      <w:r>
-        <w:rPr>
-          <w:i/>
-          <w:sz w:val="24"/>
-        </w:rPr>
+        <w:pStyle w:val="Listing"/>
+      </w:pPr>
+      <w:r>
         <w:t xml:space="preserve">    for (int i = 0; i &lt; array.Length; i++)</w:t>
       </w:r>
     </w:p>
     <w:p>
       <w:pPr>
-        <w:spacing w:line="240" w:lineRule="auto"/>
-      </w:pPr>
-      <w:r>
-        <w:rPr>
-          <w:i/>
-          <w:sz w:val="24"/>
-        </w:rPr>
+        <w:pStyle w:val="Listing"/>
+      </w:pPr>
+      <w:r>
         <w:t xml:space="preserve">        sum += array[i];</w:t>
       </w:r>
     </w:p>
     <w:p>
       <w:pPr>
-        <w:spacing w:line="240" w:lineRule="auto"/>
-      </w:pPr>
-      <w:r>
-        <w:rPr>
-          <w:i/>
-          <w:sz w:val="24"/>
-        </w:rPr>
+        <w:pStyle w:val="Listing"/>
+      </w:pPr>
+      <w:r>
         <w:t xml:space="preserve">    return sum;</w:t>
       </w:r>
     </w:p>
     <w:p>
       <w:pPr>
-        <w:spacing w:line="240" w:lineRule="auto"/>
-      </w:pPr>
-      <w:r>
-        <w:rPr>
-          <w:i/>
-          <w:sz w:val="24"/>
-        </w:rPr>
+        <w:pStyle w:val="Listing"/>
+      </w:pPr>
+      <w:r>
         <w:t>}</w:t>
       </w:r>
     </w:p>
@@ -5272,7 +4708,6 @@
         <w:jc w:val="both"/>
       </w:pPr>
       <w:r>
-        <w:lastRenderedPageBreak/>
         <w:t>Результаты показаны на рисунке 3.8.</w:t>
       </w:r>
     </w:p>
@@ -5286,8 +4721,9 @@
         <w:rPr>
           <w:noProof/>
         </w:rPr>
+        <w:lastRenderedPageBreak/>
         <w:drawing>
-          <wp:inline distT="0" distB="0" distL="0" distR="0" wp14:anchorId="57B719FA" wp14:editId="266C6895">
+          <wp:inline distT="0" distB="0" distL="0" distR="0" wp14:anchorId="1D19DB19" wp14:editId="03F71EA2">
             <wp:extent cx="5580000" cy="1776932"/>
             <wp:effectExtent l="0" t="0" r="0" b="0"/>
             <wp:docPr id="8" name="Picture 8"/>
@@ -5339,7 +4775,7 @@
         <w:jc w:val="both"/>
       </w:pPr>
       <w:r>
-        <w:t xml:space="preserve">Прямой цикл выполнился за 48 мс, вызов через делегат – за 86 мс, через виртуальный метод – за 102 мс. Сумма элементов массива равна 49995000. Первый вызов </w:t>
+        <w:t xml:space="preserve">Прямой цикл выполнился за 12 мс, вызов через делегат – за 34 мс, через виртуальный метод – за 34 мс. Сумма элементов массива равна 49995000. Первый вызов </w:t>
       </w:r>
       <w:r>
         <w:rPr>
@@ -5348,7 +4784,7 @@
         <w:t>SumArray</w:t>
       </w:r>
       <w:r>
-        <w:t xml:space="preserve"> занял 147,3 мкс, повторные вызовы в среднем 40,1 мкс, то есть </w:t>
+        <w:t xml:space="preserve"> занял 186,5 мкс, повторные вызовы в среднем 28,2 мкс, то есть </w:t>
       </w:r>
       <w:r>
         <w:rPr>
@@ -5357,7 +4793,7 @@
         <w:t>JIT</w:t>
       </w:r>
       <w:r>
-        <w:t>-компиляция удлинила первый вызов примерно в 3,7 раза.</w:t>
+        <w:t>-компиляция удлинила первый вызов примерно в 6,6 раза.</w:t>
       </w:r>
     </w:p>
     <w:p>
@@ -5370,7 +4806,7 @@
         <w:pStyle w:val="1"/>
         <w:ind w:firstLine="709"/>
       </w:pPr>
-      <w:bookmarkStart w:id="11" w:name="_Toc242378548"/>
+      <w:bookmarkStart w:id="11" w:name="_Toc242385943"/>
       <w:r>
         <w:rPr>
           <w:rFonts w:ascii="Times New Roman" w:hAnsi="Times New Roman"/>
@@ -5386,7 +4822,7 @@
         <w:spacing w:before="360"/>
         <w:ind w:firstLine="709"/>
       </w:pPr>
-      <w:bookmarkStart w:id="12" w:name="_Toc242378549"/>
+      <w:bookmarkStart w:id="12" w:name="_Toc242385944"/>
       <w:r>
         <w:rPr>
           <w:rFonts w:ascii="Times New Roman" w:hAnsi="Times New Roman"/>
@@ -5627,7 +5063,7 @@
         <w:spacing w:before="360"/>
         <w:ind w:firstLine="709"/>
       </w:pPr>
-      <w:bookmarkStart w:id="13" w:name="_Toc242378550"/>
+      <w:bookmarkStart w:id="13" w:name="_Toc242385945"/>
       <w:r>
         <w:rPr>
           <w:rFonts w:ascii="Times New Roman" w:hAnsi="Times New Roman"/>
@@ -5689,7 +5125,7 @@
         <w:spacing w:before="360"/>
         <w:ind w:firstLine="709"/>
       </w:pPr>
-      <w:bookmarkStart w:id="14" w:name="_Toc242378551"/>
+      <w:bookmarkStart w:id="14" w:name="_Toc242385946"/>
       <w:r>
         <w:rPr>
           <w:rFonts w:ascii="Times New Roman" w:hAnsi="Times New Roman"/>
@@ -5749,7 +5185,7 @@
         <w:spacing w:before="360"/>
         <w:ind w:firstLine="709"/>
       </w:pPr>
-      <w:bookmarkStart w:id="15" w:name="_Toc242378552"/>
+      <w:bookmarkStart w:id="15" w:name="_Toc242385947"/>
       <w:r>
         <w:rPr>
           <w:rFonts w:ascii="Times New Roman" w:hAnsi="Times New Roman"/>
@@ -5773,7 +5209,7 @@
         <w:spacing w:before="360"/>
         <w:ind w:firstLine="709"/>
       </w:pPr>
-      <w:bookmarkStart w:id="16" w:name="_Toc242378553"/>
+      <w:bookmarkStart w:id="16" w:name="_Toc242385948"/>
       <w:r>
         <w:rPr>
           <w:rFonts w:ascii="Times New Roman" w:hAnsi="Times New Roman"/>
@@ -5830,7 +5266,7 @@
         <w:pStyle w:val="1"/>
         <w:jc w:val="center"/>
       </w:pPr>
-      <w:bookmarkStart w:id="17" w:name="_Toc242378554"/>
+      <w:bookmarkStart w:id="17" w:name="_Toc242385949"/>
       <w:r>
         <w:rPr>
           <w:rFonts w:ascii="Times New Roman" w:hAnsi="Times New Roman"/>
@@ -5891,16 +5327,25 @@
         <w:t>BenchmarkDotNet</w:t>
       </w:r>
       <w:r>
-        <w:t xml:space="preserve"> показали, что динамические методы, вызываемые через делегат, уступают обычному коду на единицы наносекунд. Исследование </w:t>
+        <w:t xml:space="preserve"> показали, что динамический метод максимума, вызываемый через делегат, уступает встраиваемому методу на </w:t>
       </w:r>
       <w:r>
         <w:rPr>
           <w:i/>
         </w:rPr>
+        <w:t>C</w:t>
+      </w:r>
+      <w:r>
+        <w:t xml:space="preserve"># на единицы наносекунд, а динамический цикл быстрее рекурсии. Исследование </w:t>
+      </w:r>
+      <w:r>
+        <w:rPr>
+          <w:i/>
+        </w:rPr>
         <w:t>JIT</w:t>
       </w:r>
       <w:r>
-        <w:t>-компиляции показало, что первый вызов метода дольше последующих примерно в 3,7 раза из-за затрат на компиляцию. Цель работы достигнута.</w:t>
+        <w:t>-компиляции показало, что первый вызов метода дольше последующих примерно в 6,6 раза из-за затрат на компиляцию. Цель работы достигнута.</w:t>
       </w:r>
     </w:p>
     <w:sectPr>
@@ -6174,31 +5619,31 @@
       </w:rPr>
     </w:lvl>
   </w:abstractNum>
-  <w:num w:numId="1" w16cid:durableId="1207984866">
+  <w:num w:numId="1" w16cid:durableId="922639867">
     <w:abstractNumId w:val="8"/>
   </w:num>
-  <w:num w:numId="2" w16cid:durableId="2138909313">
+  <w:num w:numId="2" w16cid:durableId="1441799390">
     <w:abstractNumId w:val="6"/>
   </w:num>
-  <w:num w:numId="3" w16cid:durableId="1364742566">
+  <w:num w:numId="3" w16cid:durableId="1836527674">
     <w:abstractNumId w:val="5"/>
   </w:num>
-  <w:num w:numId="4" w16cid:durableId="1864245623">
+  <w:num w:numId="4" w16cid:durableId="714307654">
     <w:abstractNumId w:val="4"/>
   </w:num>
-  <w:num w:numId="5" w16cid:durableId="1927300217">
+  <w:num w:numId="5" w16cid:durableId="655258150">
     <w:abstractNumId w:val="7"/>
   </w:num>
-  <w:num w:numId="6" w16cid:durableId="1841502667">
+  <w:num w:numId="6" w16cid:durableId="501164684">
     <w:abstractNumId w:val="3"/>
   </w:num>
-  <w:num w:numId="7" w16cid:durableId="943340319">
+  <w:num w:numId="7" w16cid:durableId="198709755">
     <w:abstractNumId w:val="2"/>
   </w:num>
-  <w:num w:numId="8" w16cid:durableId="911309167">
+  <w:num w:numId="8" w16cid:durableId="1905214490">
     <w:abstractNumId w:val="1"/>
   </w:num>
-  <w:num w:numId="9" w16cid:durableId="305163623">
+  <w:num w:numId="9" w16cid:durableId="1134523540">
     <w:abstractNumId w:val="0"/>
   </w:num>
 </w:numbering>
@@ -17586,6 +17031,17 @@
       </w:tcPr>
     </w:tblStylePr>
   </w:style>
+  <w:style w:type="paragraph" w:customStyle="1" w:styleId="Listing">
+    <w:name w:val="Listing"/>
+    <w:basedOn w:val="a1"/>
+    <w:pPr>
+      <w:spacing w:line="240" w:lineRule="auto"/>
+    </w:pPr>
+    <w:rPr>
+      <w:i/>
+      <w:sz w:val="24"/>
+    </w:rPr>
+  </w:style>
   <w:style w:type="paragraph" w:styleId="14">
     <w:name w:val="toc 1"/>
     <w:basedOn w:val="a1"/>
@@ -17593,7 +17049,7 @@
     <w:autoRedefine/>
     <w:uiPriority w:val="39"/>
     <w:unhideWhenUsed/>
-    <w:rsid w:val="00E7589C"/>
+    <w:rsid w:val="00240C34"/>
     <w:pPr>
       <w:spacing w:after="100"/>
     </w:pPr>
@@ -17605,7 +17061,7 @@
     <w:autoRedefine/>
     <w:uiPriority w:val="39"/>
     <w:unhideWhenUsed/>
-    <w:rsid w:val="00E7589C"/>
+    <w:rsid w:val="00240C34"/>
     <w:pPr>
       <w:spacing w:after="100"/>
       <w:ind w:left="280"/>
@@ -17616,7 +17072,7 @@
     <w:basedOn w:val="a2"/>
     <w:uiPriority w:val="99"/>
     <w:unhideWhenUsed/>
-    <w:rsid w:val="00E7589C"/>
+    <w:rsid w:val="00240C34"/>
     <w:rPr>
       <w:color w:val="0000FF" w:themeColor="hyperlink"/>
       <w:u w:val="single"/>

</xml_diff>